<commit_message>
update 1.6: Adding market library containing a list of products sold
</commit_message>
<xml_diff>
--- a/Report/Report.docx
+++ b/Report/Report.docx
@@ -107,16 +107,2267 @@
           </w:r>
         </w:p>
         <w:p>
-          <w:fldSimple w:instr=" TOC \o &quot;1-3&quot; \h \z \u ">
-            <w:r>
-              <w:rPr>
-                <w:b/>
-                <w:bCs/>
-                <w:noProof/>
-              </w:rPr>
-              <w:t>No table of contents entries found.</w:t>
-            </w:r>
-          </w:fldSimple>
+          <w:pPr>
+            <w:pStyle w:val="TOC1"/>
+            <w:tabs>
+              <w:tab w:val="right" w:leader="dot" w:pos="9350"/>
+            </w:tabs>
+            <w:rPr>
+              <w:noProof/>
+            </w:rPr>
+          </w:pPr>
+          <w:r>
+            <w:fldChar w:fldCharType="begin"/>
+          </w:r>
+          <w:r>
+            <w:instrText xml:space="preserve"> TOC \o "1-3" \h \z \u </w:instrText>
+          </w:r>
+          <w:r>
+            <w:fldChar w:fldCharType="separate"/>
+          </w:r>
+          <w:hyperlink w:anchor="_Toc223792143" w:history="1">
+            <w:r>
+              <w:rPr>
+                <w:rStyle w:val="Hyperlink"/>
+                <w:noProof/>
+              </w:rPr>
+              <w:t>CHAPTER 1: INTRODUCTION</w:t>
+            </w:r>
+            <w:r>
+              <w:rPr>
+                <w:noProof/>
+                <w:webHidden/>
+              </w:rPr>
+              <w:tab/>
+            </w:r>
+            <w:r>
+              <w:rPr>
+                <w:noProof/>
+                <w:webHidden/>
+              </w:rPr>
+              <w:fldChar w:fldCharType="begin"/>
+            </w:r>
+            <w:r>
+              <w:rPr>
+                <w:noProof/>
+                <w:webHidden/>
+              </w:rPr>
+              <w:instrText xml:space="preserve"> PAGEREF _Toc223792143 \h </w:instrText>
+            </w:r>
+            <w:r>
+              <w:rPr>
+                <w:noProof/>
+                <w:webHidden/>
+              </w:rPr>
+            </w:r>
+            <w:r>
+              <w:rPr>
+                <w:noProof/>
+                <w:webHidden/>
+              </w:rPr>
+              <w:fldChar w:fldCharType="separate"/>
+            </w:r>
+            <w:r>
+              <w:rPr>
+                <w:noProof/>
+                <w:webHidden/>
+              </w:rPr>
+              <w:t>1</w:t>
+            </w:r>
+            <w:r>
+              <w:rPr>
+                <w:noProof/>
+                <w:webHidden/>
+              </w:rPr>
+              <w:fldChar w:fldCharType="end"/>
+            </w:r>
+          </w:hyperlink>
+        </w:p>
+        <w:p>
+          <w:pPr>
+            <w:pStyle w:val="TOC2"/>
+            <w:tabs>
+              <w:tab w:val="left" w:pos="960"/>
+              <w:tab w:val="right" w:leader="dot" w:pos="9350"/>
+            </w:tabs>
+            <w:rPr>
+              <w:noProof/>
+            </w:rPr>
+          </w:pPr>
+          <w:hyperlink w:anchor="_Toc223792144" w:history="1">
+            <w:r>
+              <w:rPr>
+                <w:rStyle w:val="Hyperlink"/>
+                <w:noProof/>
+              </w:rPr>
+              <w:t>1.1</w:t>
+            </w:r>
+            <w:r>
+              <w:rPr>
+                <w:noProof/>
+              </w:rPr>
+              <w:tab/>
+            </w:r>
+            <w:r>
+              <w:rPr>
+                <w:rStyle w:val="Hyperlink"/>
+                <w:noProof/>
+              </w:rPr>
+              <w:t>3Background of Study</w:t>
+            </w:r>
+            <w:r>
+              <w:rPr>
+                <w:noProof/>
+                <w:webHidden/>
+              </w:rPr>
+              <w:tab/>
+            </w:r>
+            <w:r>
+              <w:rPr>
+                <w:noProof/>
+                <w:webHidden/>
+              </w:rPr>
+              <w:fldChar w:fldCharType="begin"/>
+            </w:r>
+            <w:r>
+              <w:rPr>
+                <w:noProof/>
+                <w:webHidden/>
+              </w:rPr>
+              <w:instrText xml:space="preserve"> PAGEREF _Toc223792144 \h </w:instrText>
+            </w:r>
+            <w:r>
+              <w:rPr>
+                <w:noProof/>
+                <w:webHidden/>
+              </w:rPr>
+            </w:r>
+            <w:r>
+              <w:rPr>
+                <w:noProof/>
+                <w:webHidden/>
+              </w:rPr>
+              <w:fldChar w:fldCharType="separate"/>
+            </w:r>
+            <w:r>
+              <w:rPr>
+                <w:noProof/>
+                <w:webHidden/>
+              </w:rPr>
+              <w:t>1</w:t>
+            </w:r>
+            <w:r>
+              <w:rPr>
+                <w:noProof/>
+                <w:webHidden/>
+              </w:rPr>
+              <w:fldChar w:fldCharType="end"/>
+            </w:r>
+          </w:hyperlink>
+        </w:p>
+        <w:p>
+          <w:pPr>
+            <w:pStyle w:val="TOC2"/>
+            <w:tabs>
+              <w:tab w:val="left" w:pos="960"/>
+              <w:tab w:val="right" w:leader="dot" w:pos="9350"/>
+            </w:tabs>
+            <w:rPr>
+              <w:noProof/>
+            </w:rPr>
+          </w:pPr>
+          <w:hyperlink w:anchor="_Toc223792145" w:history="1">
+            <w:r>
+              <w:rPr>
+                <w:rStyle w:val="Hyperlink"/>
+                <w:noProof/>
+              </w:rPr>
+              <w:t>1.2</w:t>
+            </w:r>
+            <w:r>
+              <w:rPr>
+                <w:noProof/>
+              </w:rPr>
+              <w:tab/>
+            </w:r>
+            <w:r>
+              <w:rPr>
+                <w:rStyle w:val="Hyperlink"/>
+                <w:noProof/>
+              </w:rPr>
+              <w:t>Problem Statement</w:t>
+            </w:r>
+            <w:r>
+              <w:rPr>
+                <w:noProof/>
+                <w:webHidden/>
+              </w:rPr>
+              <w:tab/>
+            </w:r>
+            <w:r>
+              <w:rPr>
+                <w:noProof/>
+                <w:webHidden/>
+              </w:rPr>
+              <w:fldChar w:fldCharType="begin"/>
+            </w:r>
+            <w:r>
+              <w:rPr>
+                <w:noProof/>
+                <w:webHidden/>
+              </w:rPr>
+              <w:instrText xml:space="preserve"> PAGEREF _Toc223792145 \h </w:instrText>
+            </w:r>
+            <w:r>
+              <w:rPr>
+                <w:noProof/>
+                <w:webHidden/>
+              </w:rPr>
+            </w:r>
+            <w:r>
+              <w:rPr>
+                <w:noProof/>
+                <w:webHidden/>
+              </w:rPr>
+              <w:fldChar w:fldCharType="separate"/>
+            </w:r>
+            <w:r>
+              <w:rPr>
+                <w:noProof/>
+                <w:webHidden/>
+              </w:rPr>
+              <w:t>1</w:t>
+            </w:r>
+            <w:r>
+              <w:rPr>
+                <w:noProof/>
+                <w:webHidden/>
+              </w:rPr>
+              <w:fldChar w:fldCharType="end"/>
+            </w:r>
+          </w:hyperlink>
+        </w:p>
+        <w:p>
+          <w:pPr>
+            <w:pStyle w:val="TOC2"/>
+            <w:tabs>
+              <w:tab w:val="left" w:pos="960"/>
+              <w:tab w:val="right" w:leader="dot" w:pos="9350"/>
+            </w:tabs>
+            <w:rPr>
+              <w:noProof/>
+            </w:rPr>
+          </w:pPr>
+          <w:hyperlink w:anchor="_Toc223792146" w:history="1">
+            <w:r>
+              <w:rPr>
+                <w:rStyle w:val="Hyperlink"/>
+                <w:noProof/>
+                <w:lang w:val="en-KE"/>
+              </w:rPr>
+              <w:t>1.3</w:t>
+            </w:r>
+            <w:r>
+              <w:rPr>
+                <w:noProof/>
+              </w:rPr>
+              <w:tab/>
+            </w:r>
+            <w:r>
+              <w:rPr>
+                <w:rStyle w:val="Hyperlink"/>
+                <w:noProof/>
+                <w:lang w:val="en-KE"/>
+              </w:rPr>
+              <w:t>Objective</w:t>
+            </w:r>
+            <w:r>
+              <w:rPr>
+                <w:noProof/>
+                <w:webHidden/>
+              </w:rPr>
+              <w:tab/>
+            </w:r>
+            <w:r>
+              <w:rPr>
+                <w:noProof/>
+                <w:webHidden/>
+              </w:rPr>
+              <w:fldChar w:fldCharType="begin"/>
+            </w:r>
+            <w:r>
+              <w:rPr>
+                <w:noProof/>
+                <w:webHidden/>
+              </w:rPr>
+              <w:instrText xml:space="preserve"> PAGEREF _Toc223792146 \h </w:instrText>
+            </w:r>
+            <w:r>
+              <w:rPr>
+                <w:noProof/>
+                <w:webHidden/>
+              </w:rPr>
+            </w:r>
+            <w:r>
+              <w:rPr>
+                <w:noProof/>
+                <w:webHidden/>
+              </w:rPr>
+              <w:fldChar w:fldCharType="separate"/>
+            </w:r>
+            <w:r>
+              <w:rPr>
+                <w:noProof/>
+                <w:webHidden/>
+              </w:rPr>
+              <w:t>2</w:t>
+            </w:r>
+            <w:r>
+              <w:rPr>
+                <w:noProof/>
+                <w:webHidden/>
+              </w:rPr>
+              <w:fldChar w:fldCharType="end"/>
+            </w:r>
+          </w:hyperlink>
+        </w:p>
+        <w:p>
+          <w:pPr>
+            <w:pStyle w:val="TOC3"/>
+            <w:tabs>
+              <w:tab w:val="right" w:leader="dot" w:pos="9350"/>
+            </w:tabs>
+            <w:rPr>
+              <w:noProof/>
+            </w:rPr>
+          </w:pPr>
+          <w:hyperlink w:anchor="_Toc223792147" w:history="1">
+            <w:r>
+              <w:rPr>
+                <w:rStyle w:val="Hyperlink"/>
+                <w:noProof/>
+                <w:lang w:val="en-KE"/>
+              </w:rPr>
+              <w:t>1.3.1 General Objective</w:t>
+            </w:r>
+            <w:r>
+              <w:rPr>
+                <w:noProof/>
+                <w:webHidden/>
+              </w:rPr>
+              <w:tab/>
+            </w:r>
+            <w:r>
+              <w:rPr>
+                <w:noProof/>
+                <w:webHidden/>
+              </w:rPr>
+              <w:fldChar w:fldCharType="begin"/>
+            </w:r>
+            <w:r>
+              <w:rPr>
+                <w:noProof/>
+                <w:webHidden/>
+              </w:rPr>
+              <w:instrText xml:space="preserve"> PAGEREF _Toc223792147 \h </w:instrText>
+            </w:r>
+            <w:r>
+              <w:rPr>
+                <w:noProof/>
+                <w:webHidden/>
+              </w:rPr>
+            </w:r>
+            <w:r>
+              <w:rPr>
+                <w:noProof/>
+                <w:webHidden/>
+              </w:rPr>
+              <w:fldChar w:fldCharType="separate"/>
+            </w:r>
+            <w:r>
+              <w:rPr>
+                <w:noProof/>
+                <w:webHidden/>
+              </w:rPr>
+              <w:t>2</w:t>
+            </w:r>
+            <w:r>
+              <w:rPr>
+                <w:noProof/>
+                <w:webHidden/>
+              </w:rPr>
+              <w:fldChar w:fldCharType="end"/>
+            </w:r>
+          </w:hyperlink>
+        </w:p>
+        <w:p>
+          <w:pPr>
+            <w:pStyle w:val="TOC3"/>
+            <w:tabs>
+              <w:tab w:val="right" w:leader="dot" w:pos="9350"/>
+            </w:tabs>
+            <w:rPr>
+              <w:noProof/>
+            </w:rPr>
+          </w:pPr>
+          <w:hyperlink w:anchor="_Toc223792148" w:history="1">
+            <w:r>
+              <w:rPr>
+                <w:rStyle w:val="Hyperlink"/>
+                <w:noProof/>
+                <w:lang w:val="en-KE"/>
+              </w:rPr>
+              <w:t>1.3.2 Specific Objectives</w:t>
+            </w:r>
+            <w:r>
+              <w:rPr>
+                <w:noProof/>
+                <w:webHidden/>
+              </w:rPr>
+              <w:tab/>
+            </w:r>
+            <w:r>
+              <w:rPr>
+                <w:noProof/>
+                <w:webHidden/>
+              </w:rPr>
+              <w:fldChar w:fldCharType="begin"/>
+            </w:r>
+            <w:r>
+              <w:rPr>
+                <w:noProof/>
+                <w:webHidden/>
+              </w:rPr>
+              <w:instrText xml:space="preserve"> PAGEREF _Toc223792148 \h </w:instrText>
+            </w:r>
+            <w:r>
+              <w:rPr>
+                <w:noProof/>
+                <w:webHidden/>
+              </w:rPr>
+            </w:r>
+            <w:r>
+              <w:rPr>
+                <w:noProof/>
+                <w:webHidden/>
+              </w:rPr>
+              <w:fldChar w:fldCharType="separate"/>
+            </w:r>
+            <w:r>
+              <w:rPr>
+                <w:noProof/>
+                <w:webHidden/>
+              </w:rPr>
+              <w:t>2</w:t>
+            </w:r>
+            <w:r>
+              <w:rPr>
+                <w:noProof/>
+                <w:webHidden/>
+              </w:rPr>
+              <w:fldChar w:fldCharType="end"/>
+            </w:r>
+          </w:hyperlink>
+        </w:p>
+        <w:p>
+          <w:pPr>
+            <w:pStyle w:val="TOC2"/>
+            <w:tabs>
+              <w:tab w:val="right" w:leader="dot" w:pos="9350"/>
+            </w:tabs>
+            <w:rPr>
+              <w:noProof/>
+            </w:rPr>
+          </w:pPr>
+          <w:hyperlink w:anchor="_Toc223792149" w:history="1">
+            <w:r>
+              <w:rPr>
+                <w:rStyle w:val="Hyperlink"/>
+                <w:noProof/>
+                <w:lang w:val="en-KE"/>
+              </w:rPr>
+              <w:t>1.4 Purpose, Scope, and Application</w:t>
+            </w:r>
+            <w:r>
+              <w:rPr>
+                <w:noProof/>
+                <w:webHidden/>
+              </w:rPr>
+              <w:tab/>
+            </w:r>
+            <w:r>
+              <w:rPr>
+                <w:noProof/>
+                <w:webHidden/>
+              </w:rPr>
+              <w:fldChar w:fldCharType="begin"/>
+            </w:r>
+            <w:r>
+              <w:rPr>
+                <w:noProof/>
+                <w:webHidden/>
+              </w:rPr>
+              <w:instrText xml:space="preserve"> PAGEREF _Toc223792149 \h </w:instrText>
+            </w:r>
+            <w:r>
+              <w:rPr>
+                <w:noProof/>
+                <w:webHidden/>
+              </w:rPr>
+            </w:r>
+            <w:r>
+              <w:rPr>
+                <w:noProof/>
+                <w:webHidden/>
+              </w:rPr>
+              <w:fldChar w:fldCharType="separate"/>
+            </w:r>
+            <w:r>
+              <w:rPr>
+                <w:noProof/>
+                <w:webHidden/>
+              </w:rPr>
+              <w:t>2</w:t>
+            </w:r>
+            <w:r>
+              <w:rPr>
+                <w:noProof/>
+                <w:webHidden/>
+              </w:rPr>
+              <w:fldChar w:fldCharType="end"/>
+            </w:r>
+          </w:hyperlink>
+        </w:p>
+        <w:p>
+          <w:pPr>
+            <w:pStyle w:val="TOC3"/>
+            <w:tabs>
+              <w:tab w:val="right" w:leader="dot" w:pos="9350"/>
+            </w:tabs>
+            <w:rPr>
+              <w:noProof/>
+            </w:rPr>
+          </w:pPr>
+          <w:hyperlink w:anchor="_Toc223792150" w:history="1">
+            <w:r>
+              <w:rPr>
+                <w:rStyle w:val="Hyperlink"/>
+                <w:noProof/>
+                <w:lang w:val="en-KE"/>
+              </w:rPr>
+              <w:t>1.4.1 Purpose</w:t>
+            </w:r>
+            <w:r>
+              <w:rPr>
+                <w:noProof/>
+                <w:webHidden/>
+              </w:rPr>
+              <w:tab/>
+            </w:r>
+            <w:r>
+              <w:rPr>
+                <w:noProof/>
+                <w:webHidden/>
+              </w:rPr>
+              <w:fldChar w:fldCharType="begin"/>
+            </w:r>
+            <w:r>
+              <w:rPr>
+                <w:noProof/>
+                <w:webHidden/>
+              </w:rPr>
+              <w:instrText xml:space="preserve"> PAGEREF _Toc223792150 \h </w:instrText>
+            </w:r>
+            <w:r>
+              <w:rPr>
+                <w:noProof/>
+                <w:webHidden/>
+              </w:rPr>
+            </w:r>
+            <w:r>
+              <w:rPr>
+                <w:noProof/>
+                <w:webHidden/>
+              </w:rPr>
+              <w:fldChar w:fldCharType="separate"/>
+            </w:r>
+            <w:r>
+              <w:rPr>
+                <w:noProof/>
+                <w:webHidden/>
+              </w:rPr>
+              <w:t>2</w:t>
+            </w:r>
+            <w:r>
+              <w:rPr>
+                <w:noProof/>
+                <w:webHidden/>
+              </w:rPr>
+              <w:fldChar w:fldCharType="end"/>
+            </w:r>
+          </w:hyperlink>
+        </w:p>
+        <w:p>
+          <w:pPr>
+            <w:pStyle w:val="TOC3"/>
+            <w:tabs>
+              <w:tab w:val="right" w:leader="dot" w:pos="9350"/>
+            </w:tabs>
+            <w:rPr>
+              <w:noProof/>
+            </w:rPr>
+          </w:pPr>
+          <w:hyperlink w:anchor="_Toc223792151" w:history="1">
+            <w:r>
+              <w:rPr>
+                <w:rStyle w:val="Hyperlink"/>
+                <w:noProof/>
+                <w:lang w:val="en-KE"/>
+              </w:rPr>
+              <w:t>1.4.2 Scope</w:t>
+            </w:r>
+            <w:r>
+              <w:rPr>
+                <w:noProof/>
+                <w:webHidden/>
+              </w:rPr>
+              <w:tab/>
+            </w:r>
+            <w:r>
+              <w:rPr>
+                <w:noProof/>
+                <w:webHidden/>
+              </w:rPr>
+              <w:fldChar w:fldCharType="begin"/>
+            </w:r>
+            <w:r>
+              <w:rPr>
+                <w:noProof/>
+                <w:webHidden/>
+              </w:rPr>
+              <w:instrText xml:space="preserve"> PAGEREF _Toc223792151 \h </w:instrText>
+            </w:r>
+            <w:r>
+              <w:rPr>
+                <w:noProof/>
+                <w:webHidden/>
+              </w:rPr>
+            </w:r>
+            <w:r>
+              <w:rPr>
+                <w:noProof/>
+                <w:webHidden/>
+              </w:rPr>
+              <w:fldChar w:fldCharType="separate"/>
+            </w:r>
+            <w:r>
+              <w:rPr>
+                <w:noProof/>
+                <w:webHidden/>
+              </w:rPr>
+              <w:t>2</w:t>
+            </w:r>
+            <w:r>
+              <w:rPr>
+                <w:noProof/>
+                <w:webHidden/>
+              </w:rPr>
+              <w:fldChar w:fldCharType="end"/>
+            </w:r>
+          </w:hyperlink>
+        </w:p>
+        <w:p>
+          <w:pPr>
+            <w:pStyle w:val="TOC3"/>
+            <w:tabs>
+              <w:tab w:val="right" w:leader="dot" w:pos="9350"/>
+            </w:tabs>
+            <w:rPr>
+              <w:noProof/>
+            </w:rPr>
+          </w:pPr>
+          <w:hyperlink w:anchor="_Toc223792152" w:history="1">
+            <w:r>
+              <w:rPr>
+                <w:rStyle w:val="Hyperlink"/>
+                <w:noProof/>
+                <w:lang w:val="en-KE"/>
+              </w:rPr>
+              <w:t>1.4.3 Application</w:t>
+            </w:r>
+            <w:r>
+              <w:rPr>
+                <w:noProof/>
+                <w:webHidden/>
+              </w:rPr>
+              <w:tab/>
+            </w:r>
+            <w:r>
+              <w:rPr>
+                <w:noProof/>
+                <w:webHidden/>
+              </w:rPr>
+              <w:fldChar w:fldCharType="begin"/>
+            </w:r>
+            <w:r>
+              <w:rPr>
+                <w:noProof/>
+                <w:webHidden/>
+              </w:rPr>
+              <w:instrText xml:space="preserve"> PAGEREF _Toc223792152 \h </w:instrText>
+            </w:r>
+            <w:r>
+              <w:rPr>
+                <w:noProof/>
+                <w:webHidden/>
+              </w:rPr>
+            </w:r>
+            <w:r>
+              <w:rPr>
+                <w:noProof/>
+                <w:webHidden/>
+              </w:rPr>
+              <w:fldChar w:fldCharType="separate"/>
+            </w:r>
+            <w:r>
+              <w:rPr>
+                <w:noProof/>
+                <w:webHidden/>
+              </w:rPr>
+              <w:t>3</w:t>
+            </w:r>
+            <w:r>
+              <w:rPr>
+                <w:noProof/>
+                <w:webHidden/>
+              </w:rPr>
+              <w:fldChar w:fldCharType="end"/>
+            </w:r>
+          </w:hyperlink>
+        </w:p>
+        <w:p>
+          <w:pPr>
+            <w:pStyle w:val="TOC1"/>
+            <w:tabs>
+              <w:tab w:val="right" w:leader="dot" w:pos="9350"/>
+            </w:tabs>
+            <w:rPr>
+              <w:noProof/>
+            </w:rPr>
+          </w:pPr>
+          <w:hyperlink w:anchor="_Toc223792153" w:history="1">
+            <w:r>
+              <w:rPr>
+                <w:rStyle w:val="Hyperlink"/>
+                <w:noProof/>
+                <w:lang w:val="en-KE"/>
+              </w:rPr>
+              <w:t>CHAPTER 2: LITERATURE REVIEW</w:t>
+            </w:r>
+            <w:r>
+              <w:rPr>
+                <w:noProof/>
+                <w:webHidden/>
+              </w:rPr>
+              <w:tab/>
+            </w:r>
+            <w:r>
+              <w:rPr>
+                <w:noProof/>
+                <w:webHidden/>
+              </w:rPr>
+              <w:fldChar w:fldCharType="begin"/>
+            </w:r>
+            <w:r>
+              <w:rPr>
+                <w:noProof/>
+                <w:webHidden/>
+              </w:rPr>
+              <w:instrText xml:space="preserve"> PAGEREF _Toc223792153 \h </w:instrText>
+            </w:r>
+            <w:r>
+              <w:rPr>
+                <w:noProof/>
+                <w:webHidden/>
+              </w:rPr>
+            </w:r>
+            <w:r>
+              <w:rPr>
+                <w:noProof/>
+                <w:webHidden/>
+              </w:rPr>
+              <w:fldChar w:fldCharType="separate"/>
+            </w:r>
+            <w:r>
+              <w:rPr>
+                <w:noProof/>
+                <w:webHidden/>
+              </w:rPr>
+              <w:t>4</w:t>
+            </w:r>
+            <w:r>
+              <w:rPr>
+                <w:noProof/>
+                <w:webHidden/>
+              </w:rPr>
+              <w:fldChar w:fldCharType="end"/>
+            </w:r>
+          </w:hyperlink>
+        </w:p>
+        <w:p>
+          <w:pPr>
+            <w:pStyle w:val="TOC2"/>
+            <w:tabs>
+              <w:tab w:val="right" w:leader="dot" w:pos="9350"/>
+            </w:tabs>
+            <w:rPr>
+              <w:noProof/>
+            </w:rPr>
+          </w:pPr>
+          <w:hyperlink w:anchor="_Toc223792154" w:history="1">
+            <w:r>
+              <w:rPr>
+                <w:rStyle w:val="Hyperlink"/>
+                <w:noProof/>
+                <w:lang w:val="en-KE"/>
+              </w:rPr>
+              <w:t>2.1 Introduction</w:t>
+            </w:r>
+            <w:r>
+              <w:rPr>
+                <w:noProof/>
+                <w:webHidden/>
+              </w:rPr>
+              <w:tab/>
+            </w:r>
+            <w:r>
+              <w:rPr>
+                <w:noProof/>
+                <w:webHidden/>
+              </w:rPr>
+              <w:fldChar w:fldCharType="begin"/>
+            </w:r>
+            <w:r>
+              <w:rPr>
+                <w:noProof/>
+                <w:webHidden/>
+              </w:rPr>
+              <w:instrText xml:space="preserve"> PAGEREF _Toc223792154 \h </w:instrText>
+            </w:r>
+            <w:r>
+              <w:rPr>
+                <w:noProof/>
+                <w:webHidden/>
+              </w:rPr>
+            </w:r>
+            <w:r>
+              <w:rPr>
+                <w:noProof/>
+                <w:webHidden/>
+              </w:rPr>
+              <w:fldChar w:fldCharType="separate"/>
+            </w:r>
+            <w:r>
+              <w:rPr>
+                <w:noProof/>
+                <w:webHidden/>
+              </w:rPr>
+              <w:t>4</w:t>
+            </w:r>
+            <w:r>
+              <w:rPr>
+                <w:noProof/>
+                <w:webHidden/>
+              </w:rPr>
+              <w:fldChar w:fldCharType="end"/>
+            </w:r>
+          </w:hyperlink>
+        </w:p>
+        <w:p>
+          <w:pPr>
+            <w:pStyle w:val="TOC2"/>
+            <w:tabs>
+              <w:tab w:val="right" w:leader="dot" w:pos="9350"/>
+            </w:tabs>
+            <w:rPr>
+              <w:noProof/>
+            </w:rPr>
+          </w:pPr>
+          <w:hyperlink w:anchor="_Toc223792155" w:history="1">
+            <w:r>
+              <w:rPr>
+                <w:rStyle w:val="Hyperlink"/>
+                <w:noProof/>
+                <w:lang w:val="en-KE"/>
+              </w:rPr>
+              <w:t>2.2 Existing Systems in Your Area of Research</w:t>
+            </w:r>
+            <w:r>
+              <w:rPr>
+                <w:noProof/>
+                <w:webHidden/>
+              </w:rPr>
+              <w:tab/>
+            </w:r>
+            <w:r>
+              <w:rPr>
+                <w:noProof/>
+                <w:webHidden/>
+              </w:rPr>
+              <w:fldChar w:fldCharType="begin"/>
+            </w:r>
+            <w:r>
+              <w:rPr>
+                <w:noProof/>
+                <w:webHidden/>
+              </w:rPr>
+              <w:instrText xml:space="preserve"> PAGEREF _Toc223792155 \h </w:instrText>
+            </w:r>
+            <w:r>
+              <w:rPr>
+                <w:noProof/>
+                <w:webHidden/>
+              </w:rPr>
+            </w:r>
+            <w:r>
+              <w:rPr>
+                <w:noProof/>
+                <w:webHidden/>
+              </w:rPr>
+              <w:fldChar w:fldCharType="separate"/>
+            </w:r>
+            <w:r>
+              <w:rPr>
+                <w:noProof/>
+                <w:webHidden/>
+              </w:rPr>
+              <w:t>4</w:t>
+            </w:r>
+            <w:r>
+              <w:rPr>
+                <w:noProof/>
+                <w:webHidden/>
+              </w:rPr>
+              <w:fldChar w:fldCharType="end"/>
+            </w:r>
+          </w:hyperlink>
+        </w:p>
+        <w:p>
+          <w:pPr>
+            <w:pStyle w:val="TOC3"/>
+            <w:tabs>
+              <w:tab w:val="right" w:leader="dot" w:pos="9350"/>
+            </w:tabs>
+            <w:rPr>
+              <w:noProof/>
+            </w:rPr>
+          </w:pPr>
+          <w:hyperlink w:anchor="_Toc223792156" w:history="1">
+            <w:r>
+              <w:rPr>
+                <w:rStyle w:val="Hyperlink"/>
+                <w:noProof/>
+                <w:lang w:val="en-KE"/>
+              </w:rPr>
+              <w:t>2.2.1 How it Works</w:t>
+            </w:r>
+            <w:r>
+              <w:rPr>
+                <w:noProof/>
+                <w:webHidden/>
+              </w:rPr>
+              <w:tab/>
+            </w:r>
+            <w:r>
+              <w:rPr>
+                <w:noProof/>
+                <w:webHidden/>
+              </w:rPr>
+              <w:fldChar w:fldCharType="begin"/>
+            </w:r>
+            <w:r>
+              <w:rPr>
+                <w:noProof/>
+                <w:webHidden/>
+              </w:rPr>
+              <w:instrText xml:space="preserve"> PAGEREF _Toc223792156 \h </w:instrText>
+            </w:r>
+            <w:r>
+              <w:rPr>
+                <w:noProof/>
+                <w:webHidden/>
+              </w:rPr>
+            </w:r>
+            <w:r>
+              <w:rPr>
+                <w:noProof/>
+                <w:webHidden/>
+              </w:rPr>
+              <w:fldChar w:fldCharType="separate"/>
+            </w:r>
+            <w:r>
+              <w:rPr>
+                <w:noProof/>
+                <w:webHidden/>
+              </w:rPr>
+              <w:t>4</w:t>
+            </w:r>
+            <w:r>
+              <w:rPr>
+                <w:noProof/>
+                <w:webHidden/>
+              </w:rPr>
+              <w:fldChar w:fldCharType="end"/>
+            </w:r>
+          </w:hyperlink>
+        </w:p>
+        <w:p>
+          <w:pPr>
+            <w:pStyle w:val="TOC3"/>
+            <w:tabs>
+              <w:tab w:val="right" w:leader="dot" w:pos="9350"/>
+            </w:tabs>
+            <w:rPr>
+              <w:noProof/>
+            </w:rPr>
+          </w:pPr>
+          <w:hyperlink w:anchor="_Toc223792157" w:history="1">
+            <w:r>
+              <w:rPr>
+                <w:rStyle w:val="Hyperlink"/>
+                <w:noProof/>
+                <w:lang w:val="en-KE"/>
+              </w:rPr>
+              <w:t>2.2.2 Advantages</w:t>
+            </w:r>
+            <w:r>
+              <w:rPr>
+                <w:noProof/>
+                <w:webHidden/>
+              </w:rPr>
+              <w:tab/>
+            </w:r>
+            <w:r>
+              <w:rPr>
+                <w:noProof/>
+                <w:webHidden/>
+              </w:rPr>
+              <w:fldChar w:fldCharType="begin"/>
+            </w:r>
+            <w:r>
+              <w:rPr>
+                <w:noProof/>
+                <w:webHidden/>
+              </w:rPr>
+              <w:instrText xml:space="preserve"> PAGEREF _Toc223792157 \h </w:instrText>
+            </w:r>
+            <w:r>
+              <w:rPr>
+                <w:noProof/>
+                <w:webHidden/>
+              </w:rPr>
+            </w:r>
+            <w:r>
+              <w:rPr>
+                <w:noProof/>
+                <w:webHidden/>
+              </w:rPr>
+              <w:fldChar w:fldCharType="separate"/>
+            </w:r>
+            <w:r>
+              <w:rPr>
+                <w:noProof/>
+                <w:webHidden/>
+              </w:rPr>
+              <w:t>4</w:t>
+            </w:r>
+            <w:r>
+              <w:rPr>
+                <w:noProof/>
+                <w:webHidden/>
+              </w:rPr>
+              <w:fldChar w:fldCharType="end"/>
+            </w:r>
+          </w:hyperlink>
+        </w:p>
+        <w:p>
+          <w:pPr>
+            <w:pStyle w:val="TOC3"/>
+            <w:tabs>
+              <w:tab w:val="right" w:leader="dot" w:pos="9350"/>
+            </w:tabs>
+            <w:rPr>
+              <w:noProof/>
+            </w:rPr>
+          </w:pPr>
+          <w:hyperlink w:anchor="_Toc223792158" w:history="1">
+            <w:r>
+              <w:rPr>
+                <w:rStyle w:val="Hyperlink"/>
+                <w:noProof/>
+                <w:lang w:val="en-KE"/>
+              </w:rPr>
+              <w:t>2.2.3 Limitations</w:t>
+            </w:r>
+            <w:r>
+              <w:rPr>
+                <w:noProof/>
+                <w:webHidden/>
+              </w:rPr>
+              <w:tab/>
+            </w:r>
+            <w:r>
+              <w:rPr>
+                <w:noProof/>
+                <w:webHidden/>
+              </w:rPr>
+              <w:fldChar w:fldCharType="begin"/>
+            </w:r>
+            <w:r>
+              <w:rPr>
+                <w:noProof/>
+                <w:webHidden/>
+              </w:rPr>
+              <w:instrText xml:space="preserve"> PAGEREF _Toc223792158 \h </w:instrText>
+            </w:r>
+            <w:r>
+              <w:rPr>
+                <w:noProof/>
+                <w:webHidden/>
+              </w:rPr>
+            </w:r>
+            <w:r>
+              <w:rPr>
+                <w:noProof/>
+                <w:webHidden/>
+              </w:rPr>
+              <w:fldChar w:fldCharType="separate"/>
+            </w:r>
+            <w:r>
+              <w:rPr>
+                <w:noProof/>
+                <w:webHidden/>
+              </w:rPr>
+              <w:t>5</w:t>
+            </w:r>
+            <w:r>
+              <w:rPr>
+                <w:noProof/>
+                <w:webHidden/>
+              </w:rPr>
+              <w:fldChar w:fldCharType="end"/>
+            </w:r>
+          </w:hyperlink>
+        </w:p>
+        <w:p>
+          <w:pPr>
+            <w:pStyle w:val="TOC2"/>
+            <w:tabs>
+              <w:tab w:val="right" w:leader="dot" w:pos="9350"/>
+            </w:tabs>
+            <w:rPr>
+              <w:noProof/>
+            </w:rPr>
+          </w:pPr>
+          <w:hyperlink w:anchor="_Toc223792159" w:history="1">
+            <w:r>
+              <w:rPr>
+                <w:rStyle w:val="Hyperlink"/>
+                <w:noProof/>
+                <w:lang w:val="en-KE"/>
+              </w:rPr>
+              <w:t>2.3 Existing Software Development Tools</w:t>
+            </w:r>
+            <w:r>
+              <w:rPr>
+                <w:noProof/>
+                <w:webHidden/>
+              </w:rPr>
+              <w:tab/>
+            </w:r>
+            <w:r>
+              <w:rPr>
+                <w:noProof/>
+                <w:webHidden/>
+              </w:rPr>
+              <w:fldChar w:fldCharType="begin"/>
+            </w:r>
+            <w:r>
+              <w:rPr>
+                <w:noProof/>
+                <w:webHidden/>
+              </w:rPr>
+              <w:instrText xml:space="preserve"> PAGEREF _Toc223792159 \h </w:instrText>
+            </w:r>
+            <w:r>
+              <w:rPr>
+                <w:noProof/>
+                <w:webHidden/>
+              </w:rPr>
+            </w:r>
+            <w:r>
+              <w:rPr>
+                <w:noProof/>
+                <w:webHidden/>
+              </w:rPr>
+              <w:fldChar w:fldCharType="separate"/>
+            </w:r>
+            <w:r>
+              <w:rPr>
+                <w:noProof/>
+                <w:webHidden/>
+              </w:rPr>
+              <w:t>5</w:t>
+            </w:r>
+            <w:r>
+              <w:rPr>
+                <w:noProof/>
+                <w:webHidden/>
+              </w:rPr>
+              <w:fldChar w:fldCharType="end"/>
+            </w:r>
+          </w:hyperlink>
+        </w:p>
+        <w:p>
+          <w:pPr>
+            <w:pStyle w:val="TOC3"/>
+            <w:tabs>
+              <w:tab w:val="right" w:leader="dot" w:pos="9350"/>
+            </w:tabs>
+            <w:rPr>
+              <w:noProof/>
+            </w:rPr>
+          </w:pPr>
+          <w:hyperlink w:anchor="_Toc223792160" w:history="1">
+            <w:r>
+              <w:rPr>
+                <w:rStyle w:val="Hyperlink"/>
+                <w:noProof/>
+                <w:lang w:val="en-KE"/>
+              </w:rPr>
+              <w:t>2.3.1 Software Development Tools</w:t>
+            </w:r>
+            <w:r>
+              <w:rPr>
+                <w:noProof/>
+                <w:webHidden/>
+              </w:rPr>
+              <w:tab/>
+            </w:r>
+            <w:r>
+              <w:rPr>
+                <w:noProof/>
+                <w:webHidden/>
+              </w:rPr>
+              <w:fldChar w:fldCharType="begin"/>
+            </w:r>
+            <w:r>
+              <w:rPr>
+                <w:noProof/>
+                <w:webHidden/>
+              </w:rPr>
+              <w:instrText xml:space="preserve"> PAGEREF _Toc223792160 \h </w:instrText>
+            </w:r>
+            <w:r>
+              <w:rPr>
+                <w:noProof/>
+                <w:webHidden/>
+              </w:rPr>
+            </w:r>
+            <w:r>
+              <w:rPr>
+                <w:noProof/>
+                <w:webHidden/>
+              </w:rPr>
+              <w:fldChar w:fldCharType="separate"/>
+            </w:r>
+            <w:r>
+              <w:rPr>
+                <w:noProof/>
+                <w:webHidden/>
+              </w:rPr>
+              <w:t>5</w:t>
+            </w:r>
+            <w:r>
+              <w:rPr>
+                <w:noProof/>
+                <w:webHidden/>
+              </w:rPr>
+              <w:fldChar w:fldCharType="end"/>
+            </w:r>
+          </w:hyperlink>
+        </w:p>
+        <w:p>
+          <w:pPr>
+            <w:pStyle w:val="TOC3"/>
+            <w:tabs>
+              <w:tab w:val="right" w:leader="dot" w:pos="9350"/>
+            </w:tabs>
+            <w:rPr>
+              <w:noProof/>
+            </w:rPr>
+          </w:pPr>
+          <w:hyperlink w:anchor="_Toc223792161" w:history="1">
+            <w:r>
+              <w:rPr>
+                <w:rStyle w:val="Hyperlink"/>
+                <w:noProof/>
+                <w:lang w:val="en-KE"/>
+              </w:rPr>
+              <w:t>2.3.2 Advantages of These Tools</w:t>
+            </w:r>
+            <w:r>
+              <w:rPr>
+                <w:noProof/>
+                <w:webHidden/>
+              </w:rPr>
+              <w:tab/>
+            </w:r>
+            <w:r>
+              <w:rPr>
+                <w:noProof/>
+                <w:webHidden/>
+              </w:rPr>
+              <w:fldChar w:fldCharType="begin"/>
+            </w:r>
+            <w:r>
+              <w:rPr>
+                <w:noProof/>
+                <w:webHidden/>
+              </w:rPr>
+              <w:instrText xml:space="preserve"> PAGEREF _Toc223792161 \h </w:instrText>
+            </w:r>
+            <w:r>
+              <w:rPr>
+                <w:noProof/>
+                <w:webHidden/>
+              </w:rPr>
+            </w:r>
+            <w:r>
+              <w:rPr>
+                <w:noProof/>
+                <w:webHidden/>
+              </w:rPr>
+              <w:fldChar w:fldCharType="separate"/>
+            </w:r>
+            <w:r>
+              <w:rPr>
+                <w:noProof/>
+                <w:webHidden/>
+              </w:rPr>
+              <w:t>6</w:t>
+            </w:r>
+            <w:r>
+              <w:rPr>
+                <w:noProof/>
+                <w:webHidden/>
+              </w:rPr>
+              <w:fldChar w:fldCharType="end"/>
+            </w:r>
+          </w:hyperlink>
+        </w:p>
+        <w:p>
+          <w:pPr>
+            <w:pStyle w:val="TOC3"/>
+            <w:tabs>
+              <w:tab w:val="right" w:leader="dot" w:pos="9350"/>
+            </w:tabs>
+            <w:rPr>
+              <w:noProof/>
+            </w:rPr>
+          </w:pPr>
+          <w:hyperlink w:anchor="_Toc223792162" w:history="1">
+            <w:r>
+              <w:rPr>
+                <w:rStyle w:val="Hyperlink"/>
+                <w:noProof/>
+                <w:lang w:val="en-KE"/>
+              </w:rPr>
+              <w:t>2.3.3 Limitations</w:t>
+            </w:r>
+            <w:r>
+              <w:rPr>
+                <w:noProof/>
+                <w:webHidden/>
+              </w:rPr>
+              <w:tab/>
+            </w:r>
+            <w:r>
+              <w:rPr>
+                <w:noProof/>
+                <w:webHidden/>
+              </w:rPr>
+              <w:fldChar w:fldCharType="begin"/>
+            </w:r>
+            <w:r>
+              <w:rPr>
+                <w:noProof/>
+                <w:webHidden/>
+              </w:rPr>
+              <w:instrText xml:space="preserve"> PAGEREF _Toc223792162 \h </w:instrText>
+            </w:r>
+            <w:r>
+              <w:rPr>
+                <w:noProof/>
+                <w:webHidden/>
+              </w:rPr>
+            </w:r>
+            <w:r>
+              <w:rPr>
+                <w:noProof/>
+                <w:webHidden/>
+              </w:rPr>
+              <w:fldChar w:fldCharType="separate"/>
+            </w:r>
+            <w:r>
+              <w:rPr>
+                <w:noProof/>
+                <w:webHidden/>
+              </w:rPr>
+              <w:t>6</w:t>
+            </w:r>
+            <w:r>
+              <w:rPr>
+                <w:noProof/>
+                <w:webHidden/>
+              </w:rPr>
+              <w:fldChar w:fldCharType="end"/>
+            </w:r>
+          </w:hyperlink>
+        </w:p>
+        <w:p>
+          <w:pPr>
+            <w:pStyle w:val="TOC2"/>
+            <w:tabs>
+              <w:tab w:val="right" w:leader="dot" w:pos="9350"/>
+            </w:tabs>
+            <w:rPr>
+              <w:noProof/>
+            </w:rPr>
+          </w:pPr>
+          <w:hyperlink w:anchor="_Toc223792163" w:history="1">
+            <w:r>
+              <w:rPr>
+                <w:rStyle w:val="Hyperlink"/>
+                <w:noProof/>
+                <w:lang w:val="en-KE"/>
+              </w:rPr>
+              <w:t>2.4 Evaluation Matrix</w:t>
+            </w:r>
+            <w:r>
+              <w:rPr>
+                <w:noProof/>
+                <w:webHidden/>
+              </w:rPr>
+              <w:tab/>
+            </w:r>
+            <w:r>
+              <w:rPr>
+                <w:noProof/>
+                <w:webHidden/>
+              </w:rPr>
+              <w:fldChar w:fldCharType="begin"/>
+            </w:r>
+            <w:r>
+              <w:rPr>
+                <w:noProof/>
+                <w:webHidden/>
+              </w:rPr>
+              <w:instrText xml:space="preserve"> PAGEREF _Toc223792163 \h </w:instrText>
+            </w:r>
+            <w:r>
+              <w:rPr>
+                <w:noProof/>
+                <w:webHidden/>
+              </w:rPr>
+            </w:r>
+            <w:r>
+              <w:rPr>
+                <w:noProof/>
+                <w:webHidden/>
+              </w:rPr>
+              <w:fldChar w:fldCharType="separate"/>
+            </w:r>
+            <w:r>
+              <w:rPr>
+                <w:noProof/>
+                <w:webHidden/>
+              </w:rPr>
+              <w:t>6</w:t>
+            </w:r>
+            <w:r>
+              <w:rPr>
+                <w:noProof/>
+                <w:webHidden/>
+              </w:rPr>
+              <w:fldChar w:fldCharType="end"/>
+            </w:r>
+          </w:hyperlink>
+        </w:p>
+        <w:p>
+          <w:pPr>
+            <w:pStyle w:val="TOC2"/>
+            <w:tabs>
+              <w:tab w:val="right" w:leader="dot" w:pos="9350"/>
+            </w:tabs>
+            <w:rPr>
+              <w:noProof/>
+            </w:rPr>
+          </w:pPr>
+          <w:hyperlink w:anchor="_Toc223792164" w:history="1">
+            <w:r>
+              <w:rPr>
+                <w:rStyle w:val="Hyperlink"/>
+                <w:noProof/>
+                <w:lang w:val="en-KE"/>
+              </w:rPr>
+              <w:t>2.5 Conclusion</w:t>
+            </w:r>
+            <w:r>
+              <w:rPr>
+                <w:noProof/>
+                <w:webHidden/>
+              </w:rPr>
+              <w:tab/>
+            </w:r>
+            <w:r>
+              <w:rPr>
+                <w:noProof/>
+                <w:webHidden/>
+              </w:rPr>
+              <w:fldChar w:fldCharType="begin"/>
+            </w:r>
+            <w:r>
+              <w:rPr>
+                <w:noProof/>
+                <w:webHidden/>
+              </w:rPr>
+              <w:instrText xml:space="preserve"> PAGEREF _Toc223792164 \h </w:instrText>
+            </w:r>
+            <w:r>
+              <w:rPr>
+                <w:noProof/>
+                <w:webHidden/>
+              </w:rPr>
+            </w:r>
+            <w:r>
+              <w:rPr>
+                <w:noProof/>
+                <w:webHidden/>
+              </w:rPr>
+              <w:fldChar w:fldCharType="separate"/>
+            </w:r>
+            <w:r>
+              <w:rPr>
+                <w:noProof/>
+                <w:webHidden/>
+              </w:rPr>
+              <w:t>7</w:t>
+            </w:r>
+            <w:r>
+              <w:rPr>
+                <w:noProof/>
+                <w:webHidden/>
+              </w:rPr>
+              <w:fldChar w:fldCharType="end"/>
+            </w:r>
+          </w:hyperlink>
+        </w:p>
+        <w:p>
+          <w:pPr>
+            <w:pStyle w:val="TOC1"/>
+            <w:tabs>
+              <w:tab w:val="right" w:leader="dot" w:pos="9350"/>
+            </w:tabs>
+            <w:rPr>
+              <w:noProof/>
+            </w:rPr>
+          </w:pPr>
+          <w:hyperlink w:anchor="_Toc223792165" w:history="1">
+            <w:r>
+              <w:rPr>
+                <w:rStyle w:val="Hyperlink"/>
+                <w:noProof/>
+              </w:rPr>
+              <w:t>CHAPTER 3: RESEARCH METHODOLOGY</w:t>
+            </w:r>
+            <w:r>
+              <w:rPr>
+                <w:noProof/>
+                <w:webHidden/>
+              </w:rPr>
+              <w:tab/>
+            </w:r>
+            <w:r>
+              <w:rPr>
+                <w:noProof/>
+                <w:webHidden/>
+              </w:rPr>
+              <w:fldChar w:fldCharType="begin"/>
+            </w:r>
+            <w:r>
+              <w:rPr>
+                <w:noProof/>
+                <w:webHidden/>
+              </w:rPr>
+              <w:instrText xml:space="preserve"> PAGEREF _Toc223792165 \h </w:instrText>
+            </w:r>
+            <w:r>
+              <w:rPr>
+                <w:noProof/>
+                <w:webHidden/>
+              </w:rPr>
+            </w:r>
+            <w:r>
+              <w:rPr>
+                <w:noProof/>
+                <w:webHidden/>
+              </w:rPr>
+              <w:fldChar w:fldCharType="separate"/>
+            </w:r>
+            <w:r>
+              <w:rPr>
+                <w:noProof/>
+                <w:webHidden/>
+              </w:rPr>
+              <w:t>8</w:t>
+            </w:r>
+            <w:r>
+              <w:rPr>
+                <w:noProof/>
+                <w:webHidden/>
+              </w:rPr>
+              <w:fldChar w:fldCharType="end"/>
+            </w:r>
+          </w:hyperlink>
+        </w:p>
+        <w:p>
+          <w:pPr>
+            <w:pStyle w:val="TOC2"/>
+            <w:tabs>
+              <w:tab w:val="right" w:leader="dot" w:pos="9350"/>
+            </w:tabs>
+            <w:rPr>
+              <w:noProof/>
+            </w:rPr>
+          </w:pPr>
+          <w:hyperlink w:anchor="_Toc223792166" w:history="1">
+            <w:r>
+              <w:rPr>
+                <w:rStyle w:val="Hyperlink"/>
+                <w:noProof/>
+              </w:rPr>
+              <w:t>3.1 Introduction</w:t>
+            </w:r>
+            <w:r>
+              <w:rPr>
+                <w:noProof/>
+                <w:webHidden/>
+              </w:rPr>
+              <w:tab/>
+            </w:r>
+            <w:r>
+              <w:rPr>
+                <w:noProof/>
+                <w:webHidden/>
+              </w:rPr>
+              <w:fldChar w:fldCharType="begin"/>
+            </w:r>
+            <w:r>
+              <w:rPr>
+                <w:noProof/>
+                <w:webHidden/>
+              </w:rPr>
+              <w:instrText xml:space="preserve"> PAGEREF _Toc223792166 \h </w:instrText>
+            </w:r>
+            <w:r>
+              <w:rPr>
+                <w:noProof/>
+                <w:webHidden/>
+              </w:rPr>
+            </w:r>
+            <w:r>
+              <w:rPr>
+                <w:noProof/>
+                <w:webHidden/>
+              </w:rPr>
+              <w:fldChar w:fldCharType="separate"/>
+            </w:r>
+            <w:r>
+              <w:rPr>
+                <w:noProof/>
+                <w:webHidden/>
+              </w:rPr>
+              <w:t>8</w:t>
+            </w:r>
+            <w:r>
+              <w:rPr>
+                <w:noProof/>
+                <w:webHidden/>
+              </w:rPr>
+              <w:fldChar w:fldCharType="end"/>
+            </w:r>
+          </w:hyperlink>
+        </w:p>
+        <w:p>
+          <w:pPr>
+            <w:pStyle w:val="TOC2"/>
+            <w:tabs>
+              <w:tab w:val="right" w:leader="dot" w:pos="9350"/>
+            </w:tabs>
+            <w:rPr>
+              <w:noProof/>
+            </w:rPr>
+          </w:pPr>
+          <w:hyperlink w:anchor="_Toc223792167" w:history="1">
+            <w:r>
+              <w:rPr>
+                <w:rStyle w:val="Hyperlink"/>
+                <w:noProof/>
+                <w:lang w:val="en-KE"/>
+              </w:rPr>
+              <w:t>3.2 Research Process</w:t>
+            </w:r>
+            <w:r>
+              <w:rPr>
+                <w:noProof/>
+                <w:webHidden/>
+              </w:rPr>
+              <w:tab/>
+            </w:r>
+            <w:r>
+              <w:rPr>
+                <w:noProof/>
+                <w:webHidden/>
+              </w:rPr>
+              <w:fldChar w:fldCharType="begin"/>
+            </w:r>
+            <w:r>
+              <w:rPr>
+                <w:noProof/>
+                <w:webHidden/>
+              </w:rPr>
+              <w:instrText xml:space="preserve"> PAGEREF _Toc223792167 \h </w:instrText>
+            </w:r>
+            <w:r>
+              <w:rPr>
+                <w:noProof/>
+                <w:webHidden/>
+              </w:rPr>
+            </w:r>
+            <w:r>
+              <w:rPr>
+                <w:noProof/>
+                <w:webHidden/>
+              </w:rPr>
+              <w:fldChar w:fldCharType="separate"/>
+            </w:r>
+            <w:r>
+              <w:rPr>
+                <w:noProof/>
+                <w:webHidden/>
+              </w:rPr>
+              <w:t>8</w:t>
+            </w:r>
+            <w:r>
+              <w:rPr>
+                <w:noProof/>
+                <w:webHidden/>
+              </w:rPr>
+              <w:fldChar w:fldCharType="end"/>
+            </w:r>
+          </w:hyperlink>
+        </w:p>
+        <w:p>
+          <w:pPr>
+            <w:pStyle w:val="TOC2"/>
+            <w:tabs>
+              <w:tab w:val="right" w:leader="dot" w:pos="9350"/>
+            </w:tabs>
+            <w:rPr>
+              <w:noProof/>
+            </w:rPr>
+          </w:pPr>
+          <w:hyperlink w:anchor="_Toc223792168" w:history="1">
+            <w:r>
+              <w:rPr>
+                <w:rStyle w:val="Hyperlink"/>
+                <w:noProof/>
+                <w:lang w:val="en-KE"/>
+              </w:rPr>
+              <w:t>3.3 System Development Life Cycle (SDLC)</w:t>
+            </w:r>
+            <w:r>
+              <w:rPr>
+                <w:noProof/>
+                <w:webHidden/>
+              </w:rPr>
+              <w:tab/>
+            </w:r>
+            <w:r>
+              <w:rPr>
+                <w:noProof/>
+                <w:webHidden/>
+              </w:rPr>
+              <w:fldChar w:fldCharType="begin"/>
+            </w:r>
+            <w:r>
+              <w:rPr>
+                <w:noProof/>
+                <w:webHidden/>
+              </w:rPr>
+              <w:instrText xml:space="preserve"> PAGEREF _Toc223792168 \h </w:instrText>
+            </w:r>
+            <w:r>
+              <w:rPr>
+                <w:noProof/>
+                <w:webHidden/>
+              </w:rPr>
+            </w:r>
+            <w:r>
+              <w:rPr>
+                <w:noProof/>
+                <w:webHidden/>
+              </w:rPr>
+              <w:fldChar w:fldCharType="separate"/>
+            </w:r>
+            <w:r>
+              <w:rPr>
+                <w:noProof/>
+                <w:webHidden/>
+              </w:rPr>
+              <w:t>9</w:t>
+            </w:r>
+            <w:r>
+              <w:rPr>
+                <w:noProof/>
+                <w:webHidden/>
+              </w:rPr>
+              <w:fldChar w:fldCharType="end"/>
+            </w:r>
+          </w:hyperlink>
+        </w:p>
+        <w:p>
+          <w:pPr>
+            <w:pStyle w:val="TOC3"/>
+            <w:tabs>
+              <w:tab w:val="right" w:leader="dot" w:pos="9350"/>
+            </w:tabs>
+            <w:rPr>
+              <w:noProof/>
+            </w:rPr>
+          </w:pPr>
+          <w:hyperlink w:anchor="_Toc223792169" w:history="1">
+            <w:r>
+              <w:rPr>
+                <w:rStyle w:val="Hyperlink"/>
+                <w:noProof/>
+                <w:lang w:val="en-KE"/>
+              </w:rPr>
+              <w:t>3.3.1 Agile Model Overview</w:t>
+            </w:r>
+            <w:r>
+              <w:rPr>
+                <w:noProof/>
+                <w:webHidden/>
+              </w:rPr>
+              <w:tab/>
+            </w:r>
+            <w:r>
+              <w:rPr>
+                <w:noProof/>
+                <w:webHidden/>
+              </w:rPr>
+              <w:fldChar w:fldCharType="begin"/>
+            </w:r>
+            <w:r>
+              <w:rPr>
+                <w:noProof/>
+                <w:webHidden/>
+              </w:rPr>
+              <w:instrText xml:space="preserve"> PAGEREF _Toc223792169 \h </w:instrText>
+            </w:r>
+            <w:r>
+              <w:rPr>
+                <w:noProof/>
+                <w:webHidden/>
+              </w:rPr>
+            </w:r>
+            <w:r>
+              <w:rPr>
+                <w:noProof/>
+                <w:webHidden/>
+              </w:rPr>
+              <w:fldChar w:fldCharType="separate"/>
+            </w:r>
+            <w:r>
+              <w:rPr>
+                <w:noProof/>
+                <w:webHidden/>
+              </w:rPr>
+              <w:t>9</w:t>
+            </w:r>
+            <w:r>
+              <w:rPr>
+                <w:noProof/>
+                <w:webHidden/>
+              </w:rPr>
+              <w:fldChar w:fldCharType="end"/>
+            </w:r>
+          </w:hyperlink>
+        </w:p>
+        <w:p>
+          <w:pPr>
+            <w:pStyle w:val="TOC3"/>
+            <w:tabs>
+              <w:tab w:val="right" w:leader="dot" w:pos="9350"/>
+            </w:tabs>
+            <w:rPr>
+              <w:noProof/>
+            </w:rPr>
+          </w:pPr>
+          <w:hyperlink w:anchor="_Toc223792170" w:history="1">
+            <w:r>
+              <w:rPr>
+                <w:rStyle w:val="Hyperlink"/>
+                <w:noProof/>
+                <w:lang w:val="en-KE"/>
+              </w:rPr>
+              <w:t>3.3.2 Agile Process Steps</w:t>
+            </w:r>
+            <w:r>
+              <w:rPr>
+                <w:noProof/>
+                <w:webHidden/>
+              </w:rPr>
+              <w:tab/>
+            </w:r>
+            <w:r>
+              <w:rPr>
+                <w:noProof/>
+                <w:webHidden/>
+              </w:rPr>
+              <w:fldChar w:fldCharType="begin"/>
+            </w:r>
+            <w:r>
+              <w:rPr>
+                <w:noProof/>
+                <w:webHidden/>
+              </w:rPr>
+              <w:instrText xml:space="preserve"> PAGEREF _Toc223792170 \h </w:instrText>
+            </w:r>
+            <w:r>
+              <w:rPr>
+                <w:noProof/>
+                <w:webHidden/>
+              </w:rPr>
+            </w:r>
+            <w:r>
+              <w:rPr>
+                <w:noProof/>
+                <w:webHidden/>
+              </w:rPr>
+              <w:fldChar w:fldCharType="separate"/>
+            </w:r>
+            <w:r>
+              <w:rPr>
+                <w:noProof/>
+                <w:webHidden/>
+              </w:rPr>
+              <w:t>10</w:t>
+            </w:r>
+            <w:r>
+              <w:rPr>
+                <w:noProof/>
+                <w:webHidden/>
+              </w:rPr>
+              <w:fldChar w:fldCharType="end"/>
+            </w:r>
+          </w:hyperlink>
+        </w:p>
+        <w:p>
+          <w:pPr>
+            <w:pStyle w:val="TOC3"/>
+            <w:tabs>
+              <w:tab w:val="right" w:leader="dot" w:pos="9350"/>
+            </w:tabs>
+            <w:rPr>
+              <w:noProof/>
+            </w:rPr>
+          </w:pPr>
+          <w:hyperlink w:anchor="_Toc223792171" w:history="1">
+            <w:r>
+              <w:rPr>
+                <w:rStyle w:val="Hyperlink"/>
+                <w:noProof/>
+                <w:lang w:val="en-KE"/>
+              </w:rPr>
+              <w:t>3.3.3 Agile Model Diagram</w:t>
+            </w:r>
+            <w:r>
+              <w:rPr>
+                <w:noProof/>
+                <w:webHidden/>
+              </w:rPr>
+              <w:tab/>
+            </w:r>
+            <w:r>
+              <w:rPr>
+                <w:noProof/>
+                <w:webHidden/>
+              </w:rPr>
+              <w:fldChar w:fldCharType="begin"/>
+            </w:r>
+            <w:r>
+              <w:rPr>
+                <w:noProof/>
+                <w:webHidden/>
+              </w:rPr>
+              <w:instrText xml:space="preserve"> PAGEREF _Toc223792171 \h </w:instrText>
+            </w:r>
+            <w:r>
+              <w:rPr>
+                <w:noProof/>
+                <w:webHidden/>
+              </w:rPr>
+            </w:r>
+            <w:r>
+              <w:rPr>
+                <w:noProof/>
+                <w:webHidden/>
+              </w:rPr>
+              <w:fldChar w:fldCharType="separate"/>
+            </w:r>
+            <w:r>
+              <w:rPr>
+                <w:noProof/>
+                <w:webHidden/>
+              </w:rPr>
+              <w:t>11</w:t>
+            </w:r>
+            <w:r>
+              <w:rPr>
+                <w:noProof/>
+                <w:webHidden/>
+              </w:rPr>
+              <w:fldChar w:fldCharType="end"/>
+            </w:r>
+          </w:hyperlink>
+        </w:p>
+        <w:p>
+          <w:pPr>
+            <w:pStyle w:val="TOC3"/>
+            <w:tabs>
+              <w:tab w:val="right" w:leader="dot" w:pos="9350"/>
+            </w:tabs>
+            <w:rPr>
+              <w:noProof/>
+            </w:rPr>
+          </w:pPr>
+          <w:hyperlink w:anchor="_Toc223792172" w:history="1">
+            <w:r>
+              <w:rPr>
+                <w:rStyle w:val="Hyperlink"/>
+                <w:noProof/>
+                <w:lang w:val="en-KE"/>
+              </w:rPr>
+              <w:t>3.3.4 Justification for Choosing Agile</w:t>
+            </w:r>
+            <w:r>
+              <w:rPr>
+                <w:noProof/>
+                <w:webHidden/>
+              </w:rPr>
+              <w:tab/>
+            </w:r>
+            <w:r>
+              <w:rPr>
+                <w:noProof/>
+                <w:webHidden/>
+              </w:rPr>
+              <w:fldChar w:fldCharType="begin"/>
+            </w:r>
+            <w:r>
+              <w:rPr>
+                <w:noProof/>
+                <w:webHidden/>
+              </w:rPr>
+              <w:instrText xml:space="preserve"> PAGEREF _Toc223792172 \h </w:instrText>
+            </w:r>
+            <w:r>
+              <w:rPr>
+                <w:noProof/>
+                <w:webHidden/>
+              </w:rPr>
+            </w:r>
+            <w:r>
+              <w:rPr>
+                <w:noProof/>
+                <w:webHidden/>
+              </w:rPr>
+              <w:fldChar w:fldCharType="separate"/>
+            </w:r>
+            <w:r>
+              <w:rPr>
+                <w:noProof/>
+                <w:webHidden/>
+              </w:rPr>
+              <w:t>12</w:t>
+            </w:r>
+            <w:r>
+              <w:rPr>
+                <w:noProof/>
+                <w:webHidden/>
+              </w:rPr>
+              <w:fldChar w:fldCharType="end"/>
+            </w:r>
+          </w:hyperlink>
+        </w:p>
+        <w:p>
+          <w:pPr>
+            <w:pStyle w:val="TOC2"/>
+            <w:tabs>
+              <w:tab w:val="right" w:leader="dot" w:pos="9350"/>
+            </w:tabs>
+            <w:rPr>
+              <w:noProof/>
+            </w:rPr>
+          </w:pPr>
+          <w:hyperlink w:anchor="_Toc223792173" w:history="1">
+            <w:r>
+              <w:rPr>
+                <w:rStyle w:val="Hyperlink"/>
+                <w:noProof/>
+              </w:rPr>
+              <w:t>3.4 Conclusion</w:t>
+            </w:r>
+            <w:r>
+              <w:rPr>
+                <w:noProof/>
+                <w:webHidden/>
+              </w:rPr>
+              <w:tab/>
+            </w:r>
+            <w:r>
+              <w:rPr>
+                <w:noProof/>
+                <w:webHidden/>
+              </w:rPr>
+              <w:fldChar w:fldCharType="begin"/>
+            </w:r>
+            <w:r>
+              <w:rPr>
+                <w:noProof/>
+                <w:webHidden/>
+              </w:rPr>
+              <w:instrText xml:space="preserve"> PAGEREF _Toc223792173 \h </w:instrText>
+            </w:r>
+            <w:r>
+              <w:rPr>
+                <w:noProof/>
+                <w:webHidden/>
+              </w:rPr>
+            </w:r>
+            <w:r>
+              <w:rPr>
+                <w:noProof/>
+                <w:webHidden/>
+              </w:rPr>
+              <w:fldChar w:fldCharType="separate"/>
+            </w:r>
+            <w:r>
+              <w:rPr>
+                <w:noProof/>
+                <w:webHidden/>
+              </w:rPr>
+              <w:t>12</w:t>
+            </w:r>
+            <w:r>
+              <w:rPr>
+                <w:noProof/>
+                <w:webHidden/>
+              </w:rPr>
+              <w:fldChar w:fldCharType="end"/>
+            </w:r>
+          </w:hyperlink>
+        </w:p>
+        <w:p>
+          <w:pPr>
+            <w:pStyle w:val="TOC1"/>
+            <w:tabs>
+              <w:tab w:val="right" w:leader="dot" w:pos="9350"/>
+            </w:tabs>
+            <w:rPr>
+              <w:noProof/>
+            </w:rPr>
+          </w:pPr>
+          <w:hyperlink w:anchor="_Toc223792174" w:history="1">
+            <w:r>
+              <w:rPr>
+                <w:rStyle w:val="Hyperlink"/>
+                <w:noProof/>
+              </w:rPr>
+              <w:t>CHAPTER 4: SYSTEM DESIGN, IMPLEMENTATION AND TESTING</w:t>
+            </w:r>
+            <w:r>
+              <w:rPr>
+                <w:noProof/>
+                <w:webHidden/>
+              </w:rPr>
+              <w:tab/>
+            </w:r>
+            <w:r>
+              <w:rPr>
+                <w:noProof/>
+                <w:webHidden/>
+              </w:rPr>
+              <w:fldChar w:fldCharType="begin"/>
+            </w:r>
+            <w:r>
+              <w:rPr>
+                <w:noProof/>
+                <w:webHidden/>
+              </w:rPr>
+              <w:instrText xml:space="preserve"> PAGEREF _Toc223792174 \h </w:instrText>
+            </w:r>
+            <w:r>
+              <w:rPr>
+                <w:noProof/>
+                <w:webHidden/>
+              </w:rPr>
+            </w:r>
+            <w:r>
+              <w:rPr>
+                <w:noProof/>
+                <w:webHidden/>
+              </w:rPr>
+              <w:fldChar w:fldCharType="separate"/>
+            </w:r>
+            <w:r>
+              <w:rPr>
+                <w:noProof/>
+                <w:webHidden/>
+              </w:rPr>
+              <w:t>13</w:t>
+            </w:r>
+            <w:r>
+              <w:rPr>
+                <w:noProof/>
+                <w:webHidden/>
+              </w:rPr>
+              <w:fldChar w:fldCharType="end"/>
+            </w:r>
+          </w:hyperlink>
+        </w:p>
+        <w:p>
+          <w:r>
+            <w:rPr>
+              <w:b/>
+              <w:bCs/>
+              <w:noProof/>
+            </w:rPr>
+            <w:fldChar w:fldCharType="end"/>
+          </w:r>
         </w:p>
       </w:sdtContent>
     </w:sdt>
@@ -165,10 +2416,12 @@
       <w:pPr>
         <w:pStyle w:val="Heading1"/>
       </w:pPr>
+      <w:bookmarkStart w:id="0" w:name="_Toc223792143"/>
       <w:r>
         <w:lastRenderedPageBreak/>
         <w:t>CHAPTER 1: INTRODUCTION</w:t>
       </w:r>
+      <w:bookmarkEnd w:id="0"/>
     </w:p>
     <w:p>
       <w:pPr>
@@ -178,46 +2431,21 @@
           <w:numId w:val="1"/>
         </w:numPr>
       </w:pPr>
+      <w:bookmarkStart w:id="1" w:name="_Toc223792144"/>
       <w:r>
         <w:t>3</w:t>
       </w:r>
       <w:r>
         <w:t>Background of Study</w:t>
       </w:r>
+      <w:bookmarkEnd w:id="1"/>
     </w:p>
     <w:p>
       <w:pPr>
         <w:spacing w:line="360" w:lineRule="auto"/>
       </w:pPr>
       <w:r>
-        <w:t xml:space="preserve">In the modern academic environment, students face numerous challenges in accessing quality educational resources and collaborating effectively. Traditional learning methods have been supplemented by online tools, yet these tools are often fragmented. For instance, students rely on different platforms for different needs: </w:t>
-      </w:r>
-      <w:r>
-        <w:rPr>
-          <w:rStyle w:val="Strong"/>
-        </w:rPr>
-        <w:t>Q&amp;A platforms</w:t>
-      </w:r>
-      <w:r>
-        <w:t xml:space="preserve"> such as Quora or Brainly for asking questions, </w:t>
-      </w:r>
-      <w:r>
-        <w:rPr>
-          <w:rStyle w:val="Strong"/>
-        </w:rPr>
-        <w:t>social media or messaging apps</w:t>
-      </w:r>
-      <w:r>
-        <w:t xml:space="preserve"> for forming study groups, and </w:t>
-      </w:r>
-      <w:r>
-        <w:rPr>
-          <w:rStyle w:val="Strong"/>
-        </w:rPr>
-        <w:t>classified websites or campus boards</w:t>
-      </w:r>
-      <w:r>
-        <w:t xml:space="preserve"> for buying or selling used textbooks. Similarly, lecture notes are often shared through informal channels such as WhatsApp groups or Google Drive links, which can be disorganized and difficult to search.</w:t>
+        <w:t>In the modern academic environment, students face numerous challenges in accessing quality educational resources and collaborating effectively. Traditional learning methods have been supplemented by online tools, yet these tools are often fragmented. For instance, students rely on different platforms for different needs: Q&amp;A platforms such as Quora or Brainly for asking questions, social media or messaging apps for forming study groups, and classified websites or campus boards for buying or selling used textbooks. Similarly, lecture notes are often shared through informal channels such as WhatsApp groups or Google Drive links, which can be disorganized and difficult to search.</w:t>
       </w:r>
     </w:p>
     <w:p>
@@ -225,34 +2453,7 @@
         <w:spacing w:line="360" w:lineRule="auto"/>
       </w:pPr>
       <w:r>
-        <w:t xml:space="preserve">The lack of a </w:t>
-      </w:r>
-      <w:r>
-        <w:rPr>
-          <w:rStyle w:val="Strong"/>
-        </w:rPr>
-        <w:t>centralized, student-focused platform</w:t>
-      </w:r>
-      <w:r>
-        <w:t xml:space="preserve"> creates inefficiencies, making it harder for students to find academic support quickly and in an organized manner. Moreover, existing platforms often include a wide audience, making them less relevant for specific academic communities. Students require an </w:t>
-      </w:r>
-      <w:r>
-        <w:rPr>
-          <w:rStyle w:val="Strong"/>
-        </w:rPr>
-        <w:t>exclusive, academic-oriented environment</w:t>
-      </w:r>
-      <w:r>
-        <w:t xml:space="preserve"> where they can </w:t>
-      </w:r>
-      <w:r>
-        <w:rPr>
-          <w:rStyle w:val="Strong"/>
-        </w:rPr>
-        <w:t>ask questions, share notes, exchange textbooks, and collaborate in study groups</w:t>
-      </w:r>
-      <w:r>
-        <w:t xml:space="preserve"> without distractions.</w:t>
+        <w:t>The lack of a centralized, student-focused platform creates inefficiencies, making it harder for students to find academic support quickly and in an organized manner. Moreover, existing platforms often include a wide audience, making them less relevant for specific academic communities. Students require an exclusive, academic-oriented environment where they can ask questions, share notes, exchange textbooks, and collaborate in study groups without distractions.</w:t>
       </w:r>
     </w:p>
     <w:p>
@@ -260,52 +2461,7 @@
         <w:spacing w:line="360" w:lineRule="auto"/>
       </w:pPr>
       <w:r>
-        <w:t xml:space="preserve">With the rise of </w:t>
-      </w:r>
-      <w:r>
-        <w:rPr>
-          <w:rStyle w:val="Strong"/>
-        </w:rPr>
-        <w:t>digital learning trends</w:t>
-      </w:r>
-      <w:r>
-        <w:t xml:space="preserve"> and the increasing reliance on technology in education, there is a growing demand for solutions that consolidate these academic needs into one platform. A dedicated system can improve </w:t>
-      </w:r>
-      <w:r>
-        <w:rPr>
-          <w:rStyle w:val="Strong"/>
-        </w:rPr>
-        <w:t>peer-to-peer knowledge sharing</w:t>
-      </w:r>
-      <w:r>
-        <w:t xml:space="preserve">, </w:t>
-      </w:r>
-      <w:r>
-        <w:rPr>
-          <w:rStyle w:val="Strong"/>
-        </w:rPr>
-        <w:t>resource accessibility</w:t>
-      </w:r>
-      <w:r>
-        <w:t xml:space="preserve">, and </w:t>
-      </w:r>
-      <w:r>
-        <w:rPr>
-          <w:rStyle w:val="Strong"/>
-        </w:rPr>
-        <w:t>student engagement</w:t>
-      </w:r>
-      <w:r>
-        <w:t xml:space="preserve">, thereby enhancing the overall learning experience. By integrating features such as Q&amp;A forums, note sharing, a marketplace for textbooks, and study group creation, this platform aims to provide a </w:t>
-      </w:r>
-      <w:r>
-        <w:rPr>
-          <w:rStyle w:val="Strong"/>
-        </w:rPr>
-        <w:t>holistic academic support system</w:t>
-      </w:r>
-      <w:r>
-        <w:t xml:space="preserve"> for students.</w:t>
+        <w:t>With the rise of digital learning trends and the increasing reliance on technology in education, there is a growing demand for solutions that consolidate these academic needs into one platform. A dedicated system can improve peer-to-peer knowledge sharing, resource accessibility, and student engagement, thereby enhancing the overall learning experience. By integrating features such as Q&amp;A forums, note sharing, a marketplace for textbooks, and study group creation, this platform aims to provide a holistic academic support system for students.</w:t>
       </w:r>
     </w:p>
     <w:p>
@@ -316,186 +2472,66 @@
           <w:numId w:val="1"/>
         </w:numPr>
       </w:pPr>
+      <w:bookmarkStart w:id="2" w:name="_Toc223792145"/>
       <w:r>
         <w:t>Problem Statement</w:t>
       </w:r>
-    </w:p>
-    <w:p>
-      <w:pPr>
-        <w:rPr>
-          <w:lang w:val="en-KE"/>
-        </w:rPr>
-      </w:pPr>
-      <w:r>
-        <w:rPr>
-          <w:lang w:val="en-KE"/>
-        </w:rPr>
+      <w:bookmarkEnd w:id="2"/>
+    </w:p>
+    <w:p>
+      <w:pPr>
+        <w:spacing w:line="360" w:lineRule="auto"/>
+      </w:pPr>
+      <w:r>
         <w:t>Students in academic institutions often struggle to find reliable and organized resources for their studies. While multiple online platforms exist to address specific needs such as asking questions, sharing notes, or buying textbooks, these solutions are highly fragmented. For example:</w:t>
       </w:r>
     </w:p>
     <w:p>
       <w:pPr>
+        <w:pStyle w:val="ListParagraph"/>
         <w:numPr>
           <w:ilvl w:val="0"/>
-          <w:numId w:val="2"/>
+          <w:numId w:val="23"/>
         </w:numPr>
-        <w:rPr>
-          <w:lang w:val="en-KE"/>
-        </w:rPr>
-      </w:pPr>
-      <w:r>
-        <w:rPr>
-          <w:b/>
-          <w:bCs/>
-          <w:lang w:val="en-KE"/>
-        </w:rPr>
-        <w:t>Q&amp;A platforms</w:t>
-      </w:r>
-      <w:r>
-        <w:rPr>
-          <w:lang w:val="en-KE"/>
-        </w:rPr>
-        <w:t xml:space="preserve"> like Quora and Brainly allow asking questions, but they cater to a broad audience and lack focus on specific academic courses.</w:t>
-      </w:r>
-    </w:p>
-    <w:p>
-      <w:pPr>
+        <w:spacing w:line="360" w:lineRule="auto"/>
+      </w:pPr>
+      <w:r>
+        <w:t>Q&amp;A platforms like Quora and Brainly allow asking questions, but they cater to a broad audience and lack focus on specific academic courses.</w:t>
+      </w:r>
+    </w:p>
+    <w:p>
+      <w:pPr>
+        <w:pStyle w:val="ListParagraph"/>
         <w:numPr>
           <w:ilvl w:val="0"/>
-          <w:numId w:val="2"/>
+          <w:numId w:val="23"/>
         </w:numPr>
-        <w:rPr>
-          <w:lang w:val="en-KE"/>
-        </w:rPr>
-      </w:pPr>
-      <w:r>
-        <w:rPr>
-          <w:b/>
-          <w:bCs/>
-          <w:lang w:val="en-KE"/>
-        </w:rPr>
-        <w:t>Social media platforms</w:t>
-      </w:r>
-      <w:r>
-        <w:rPr>
-          <w:lang w:val="en-KE"/>
-        </w:rPr>
-        <w:t xml:space="preserve"> such as WhatsApp and Facebook groups are commonly used for sharing lecture notes and forming study groups, but they are unstructured, lack proper search functionalities, and often lead to distractions.</w:t>
-      </w:r>
-    </w:p>
-    <w:p>
-      <w:pPr>
+        <w:spacing w:line="360" w:lineRule="auto"/>
+      </w:pPr>
+      <w:r>
+        <w:t>Social media platforms such as WhatsApp and Facebook groups are commonly used for sharing lecture notes and forming study groups, but they are unstructured, lack proper search functionalities, and often lead to distractions.</w:t>
+      </w:r>
+    </w:p>
+    <w:p>
+      <w:pPr>
+        <w:pStyle w:val="ListParagraph"/>
         <w:numPr>
           <w:ilvl w:val="0"/>
-          <w:numId w:val="2"/>
+          <w:numId w:val="23"/>
         </w:numPr>
-        <w:rPr>
-          <w:lang w:val="en-KE"/>
-        </w:rPr>
-      </w:pPr>
-      <w:r>
-        <w:rPr>
-          <w:b/>
-          <w:bCs/>
-          <w:lang w:val="en-KE"/>
-        </w:rPr>
-        <w:t>Marketplaces</w:t>
-      </w:r>
-      <w:r>
-        <w:rPr>
-          <w:lang w:val="en-KE"/>
-        </w:rPr>
-        <w:t xml:space="preserve"> for selling or buying textbooks exist, but they are not integrated with academic communities and often involve trust issues.</w:t>
-      </w:r>
-    </w:p>
-    <w:p>
-      <w:pPr>
-        <w:rPr>
-          <w:lang w:val="en-KE"/>
-        </w:rPr>
-      </w:pPr>
-      <w:r>
-        <w:rPr>
-          <w:lang w:val="en-KE"/>
-        </w:rPr>
-        <w:t xml:space="preserve">This fragmentation forces students to use multiple tools, resulting in </w:t>
-      </w:r>
-      <w:r>
-        <w:rPr>
-          <w:b/>
-          <w:bCs/>
-          <w:lang w:val="en-KE"/>
-        </w:rPr>
-        <w:t>time inefficiency, information scattering, and lack of academic-focused engagement</w:t>
-      </w:r>
-      <w:r>
-        <w:rPr>
-          <w:lang w:val="en-KE"/>
-        </w:rPr>
-        <w:t xml:space="preserve">. Furthermore, there is no dedicated platform that combines </w:t>
-      </w:r>
-      <w:r>
-        <w:rPr>
-          <w:b/>
-          <w:bCs/>
-          <w:lang w:val="en-KE"/>
-        </w:rPr>
-        <w:t>academic Q&amp;A</w:t>
-      </w:r>
-      <w:r>
-        <w:rPr>
-          <w:lang w:val="en-KE"/>
-        </w:rPr>
-        <w:t xml:space="preserve">, </w:t>
-      </w:r>
-      <w:r>
-        <w:rPr>
-          <w:b/>
-          <w:bCs/>
-          <w:lang w:val="en-KE"/>
-        </w:rPr>
-        <w:t>lecture note sharing</w:t>
-      </w:r>
-      <w:r>
-        <w:rPr>
-          <w:lang w:val="en-KE"/>
-        </w:rPr>
-        <w:t xml:space="preserve">, </w:t>
-      </w:r>
-      <w:r>
-        <w:rPr>
-          <w:b/>
-          <w:bCs/>
-          <w:lang w:val="en-KE"/>
-        </w:rPr>
-        <w:t>textbook exchange</w:t>
-      </w:r>
-      <w:r>
-        <w:rPr>
-          <w:lang w:val="en-KE"/>
-        </w:rPr>
-        <w:t xml:space="preserve">, and </w:t>
-      </w:r>
-      <w:r>
-        <w:rPr>
-          <w:b/>
-          <w:bCs/>
-          <w:lang w:val="en-KE"/>
-        </w:rPr>
-        <w:t>study group creation</w:t>
-      </w:r>
-      <w:r>
-        <w:rPr>
-          <w:lang w:val="en-KE"/>
-        </w:rPr>
-        <w:t xml:space="preserve"> in a </w:t>
-      </w:r>
-      <w:r>
-        <w:rPr>
-          <w:lang w:val="en-KE"/>
-        </w:rPr>
+        <w:spacing w:line="360" w:lineRule="auto"/>
+      </w:pPr>
+      <w:r>
+        <w:t>Marketplaces for selling or buying textbooks exist, but they are not integrated with academic communities and often involve trust issues.</w:t>
+      </w:r>
+    </w:p>
+    <w:p>
+      <w:pPr>
+        <w:spacing w:line="360" w:lineRule="auto"/>
+      </w:pPr>
+      <w:r>
         <w:lastRenderedPageBreak/>
-        <w:t>secure and student-only environment. This gap creates challenges in resource accessibility, peer-to-peer learning, and academic collaboration.</w:t>
+        <w:t>This fragmentation forces students to use multiple tools, resulting in time inefficiency, information scattering, and lack of academic-focused engagement. Furthermore, there is no dedicated platform that combines academic Q&amp;A, lecture note sharing, textbook exchange, and study group creation in a secure and student-only environment. This gap creates challenges in resource accessibility, peer-to-peer learning, and academic collaboration.</w:t>
       </w:r>
     </w:p>
     <w:p>
@@ -509,12 +2545,14 @@
           <w:lang w:val="en-KE"/>
         </w:rPr>
       </w:pPr>
+      <w:bookmarkStart w:id="3" w:name="_Toc223792146"/>
       <w:r>
         <w:rPr>
           <w:lang w:val="en-KE"/>
         </w:rPr>
         <w:t>Objective</w:t>
       </w:r>
+      <w:bookmarkEnd w:id="3"/>
     </w:p>
     <w:p>
       <w:pPr>
@@ -523,68 +2561,27 @@
           <w:lang w:val="en-KE"/>
         </w:rPr>
       </w:pPr>
+      <w:bookmarkStart w:id="4" w:name="_Toc223792147"/>
       <w:r>
         <w:rPr>
           <w:lang w:val="en-KE"/>
         </w:rPr>
         <w:t>1.3.1 General Objective</w:t>
       </w:r>
-    </w:p>
-    <w:p>
-      <w:pPr>
-        <w:rPr>
-          <w:lang w:val="en-KE"/>
-        </w:rPr>
-      </w:pPr>
-      <w:r>
-        <w:rPr>
-          <w:lang w:val="en-KE"/>
-        </w:rPr>
-        <w:t xml:space="preserve">The primary objective of this project is to design and develop a </w:t>
-      </w:r>
-      <w:r>
-        <w:rPr>
-          <w:b/>
-          <w:bCs/>
-          <w:lang w:val="en-KE"/>
-        </w:rPr>
-        <w:t>student-</w:t>
-      </w:r>
-      <w:r>
-        <w:rPr>
-          <w:b/>
-          <w:bCs/>
-          <w:lang w:val="en-KE"/>
-        </w:rPr>
+      <w:bookmarkEnd w:id="4"/>
+    </w:p>
+    <w:p>
+      <w:pPr>
+        <w:spacing w:line="360" w:lineRule="auto"/>
+      </w:pPr>
+      <w:r>
+        <w:t>The primary objective of this project is to design and develop a student-</w:t>
+      </w:r>
+      <w:r>
         <w:t>oriented</w:t>
       </w:r>
       <w:r>
-        <w:rPr>
-          <w:b/>
-          <w:bCs/>
-          <w:lang w:val="en-KE"/>
-        </w:rPr>
-        <w:t xml:space="preserve"> academic collaboration platform</w:t>
-      </w:r>
-      <w:r>
-        <w:rPr>
-          <w:lang w:val="en-KE"/>
-        </w:rPr>
-        <w:t xml:space="preserve"> that centralizes key academic support features in one integrated system. The platform will allow students to </w:t>
-      </w:r>
-      <w:r>
-        <w:rPr>
-          <w:b/>
-          <w:bCs/>
-          <w:lang w:val="en-KE"/>
-        </w:rPr>
-        <w:t>ask academic questions, share lecture notes, trade used textbooks, and form study groups</w:t>
-      </w:r>
-      <w:r>
-        <w:rPr>
-          <w:lang w:val="en-KE"/>
-        </w:rPr>
-        <w:t>, thereby enhancing academic collaboration and resource accessibility.</w:t>
+        <w:t xml:space="preserve"> academic collaboration platform that centralizes key academic support features in one integrated system. The platform will allow students to ask academic questions, share lecture notes, trade used textbooks, and form study groups, thereby enhancing academic collaboration and resource accessibility.</w:t>
       </w:r>
     </w:p>
     <w:p>
@@ -594,6 +2591,7 @@
           <w:lang w:val="en-KE"/>
         </w:rPr>
       </w:pPr>
+      <w:bookmarkStart w:id="5" w:name="_Toc223792148"/>
       <w:r>
         <w:rPr>
           <w:lang w:val="en-KE"/>
@@ -606,155 +2604,78 @@
         </w:rPr>
         <w:t>Specific Objectives</w:t>
       </w:r>
-    </w:p>
-    <w:p>
-      <w:pPr>
+      <w:bookmarkEnd w:id="5"/>
+    </w:p>
+    <w:p>
+      <w:pPr>
+        <w:pStyle w:val="ListParagraph"/>
         <w:numPr>
           <w:ilvl w:val="0"/>
-          <w:numId w:val="3"/>
+          <w:numId w:val="24"/>
         </w:numPr>
-        <w:rPr>
-          <w:lang w:val="en-KE"/>
-        </w:rPr>
-      </w:pPr>
-      <w:r>
-        <w:rPr>
-          <w:b/>
-          <w:bCs/>
-          <w:lang w:val="en-KE"/>
-        </w:rPr>
-        <w:t>To provide a structured Q&amp;A feature</w:t>
-      </w:r>
-      <w:r>
-        <w:rPr>
-          <w:lang w:val="en-KE"/>
-        </w:rPr>
-        <w:t xml:space="preserve"> that allows students to post academic questions and receive answers from peers within the platform.</w:t>
-      </w:r>
-    </w:p>
-    <w:p>
-      <w:pPr>
+      </w:pPr>
+      <w:r>
+        <w:t>To provide a structured Q&amp;A feature that allows students to post academic questions and receive answers from peers within the platform.</w:t>
+      </w:r>
+    </w:p>
+    <w:p>
+      <w:pPr>
+        <w:pStyle w:val="ListParagraph"/>
         <w:numPr>
           <w:ilvl w:val="0"/>
-          <w:numId w:val="3"/>
+          <w:numId w:val="24"/>
         </w:numPr>
-        <w:rPr>
-          <w:lang w:val="en-KE"/>
-        </w:rPr>
-      </w:pPr>
-      <w:r>
-        <w:rPr>
-          <w:b/>
-          <w:bCs/>
-          <w:lang w:val="en-KE"/>
-        </w:rPr>
-        <w:t>To enable lecture note sharing</w:t>
-      </w:r>
-      <w:r>
-        <w:rPr>
-          <w:lang w:val="en-KE"/>
-        </w:rPr>
-        <w:t xml:space="preserve"> by allowing students to upload, organize, and download course materials in a secure and easily searchable environment.</w:t>
-      </w:r>
-    </w:p>
-    <w:p>
-      <w:pPr>
+      </w:pPr>
+      <w:r>
+        <w:t>To enable lecture note sharing by allowing students to upload, organize, and download course materials in a secure and easily searchable environment.</w:t>
+      </w:r>
+    </w:p>
+    <w:p>
+      <w:pPr>
+        <w:pStyle w:val="ListParagraph"/>
         <w:numPr>
           <w:ilvl w:val="0"/>
-          <w:numId w:val="3"/>
+          <w:numId w:val="24"/>
         </w:numPr>
-        <w:rPr>
-          <w:lang w:val="en-KE"/>
-        </w:rPr>
-      </w:pPr>
-      <w:r>
-        <w:rPr>
-          <w:b/>
-          <w:bCs/>
-          <w:lang w:val="en-KE"/>
-        </w:rPr>
-        <w:t>To develop a student marketplace</w:t>
-      </w:r>
-      <w:r>
-        <w:rPr>
-          <w:lang w:val="en-KE"/>
-        </w:rPr>
-        <w:t xml:space="preserve"> where users can buy, sell, or exchange used textbooks and other academic resources.</w:t>
-      </w:r>
-    </w:p>
-    <w:p>
-      <w:pPr>
+      </w:pPr>
+      <w:r>
+        <w:t>To develop a student marketplace where users can buy, sell, or exchange used textbooks and other academic resources.</w:t>
+      </w:r>
+    </w:p>
+    <w:p>
+      <w:pPr>
+        <w:pStyle w:val="ListParagraph"/>
         <w:numPr>
           <w:ilvl w:val="0"/>
-          <w:numId w:val="3"/>
+          <w:numId w:val="24"/>
         </w:numPr>
-        <w:rPr>
-          <w:lang w:val="en-KE"/>
-        </w:rPr>
-      </w:pPr>
-      <w:r>
-        <w:rPr>
-          <w:b/>
-          <w:bCs/>
-          <w:lang w:val="en-KE"/>
-        </w:rPr>
-        <w:t>To facilitate collaboration through study groups</w:t>
-      </w:r>
-      <w:r>
-        <w:rPr>
-          <w:lang w:val="en-KE"/>
-        </w:rPr>
-        <w:t xml:space="preserve"> where students can join or create groups based on courses, subjects, or academic interests.</w:t>
-      </w:r>
-    </w:p>
-    <w:p>
-      <w:pPr>
+      </w:pPr>
+      <w:r>
+        <w:t>To facilitate collaboration through study groups where students can join or create groups based on courses, subjects, or academic interests.</w:t>
+      </w:r>
+    </w:p>
+    <w:p>
+      <w:pPr>
+        <w:pStyle w:val="ListParagraph"/>
         <w:numPr>
           <w:ilvl w:val="0"/>
-          <w:numId w:val="3"/>
+          <w:numId w:val="24"/>
         </w:numPr>
-        <w:rPr>
-          <w:lang w:val="en-KE"/>
-        </w:rPr>
-      </w:pPr>
-      <w:r>
-        <w:rPr>
-          <w:b/>
-          <w:bCs/>
-          <w:lang w:val="en-KE"/>
-        </w:rPr>
-        <w:t>To design an intuitive user interface and robust backend</w:t>
-      </w:r>
-      <w:r>
-        <w:rPr>
-          <w:lang w:val="en-KE"/>
-        </w:rPr>
-        <w:t xml:space="preserve"> that supports scalability, search optimization, and real-time engagement.</w:t>
-      </w:r>
-    </w:p>
-    <w:p>
-      <w:pPr>
+      </w:pPr>
+      <w:r>
+        <w:t>To design an intuitive user interface and robust backend that supports scalability, search optimization, and real-time engagement.</w:t>
+      </w:r>
+    </w:p>
+    <w:p>
+      <w:pPr>
+        <w:pStyle w:val="ListParagraph"/>
         <w:numPr>
           <w:ilvl w:val="0"/>
-          <w:numId w:val="3"/>
+          <w:numId w:val="24"/>
         </w:numPr>
-        <w:rPr>
-          <w:lang w:val="en-KE"/>
-        </w:rPr>
-      </w:pPr>
-      <w:r>
-        <w:rPr>
-          <w:b/>
-          <w:bCs/>
-          <w:lang w:val="en-KE"/>
-        </w:rPr>
-        <w:t>To ensure data security and privacy</w:t>
-      </w:r>
-      <w:r>
-        <w:rPr>
-          <w:lang w:val="en-KE"/>
-        </w:rPr>
-        <w:t xml:space="preserve"> through proper authentication, authorization, and encryption techniques.</w:t>
+      </w:pPr>
+      <w:r>
+        <w:t>To ensure data security and privacy through proper authentication, authorization, and encryption techniques.</w:t>
       </w:r>
     </w:p>
     <w:p>
@@ -764,12 +2685,14 @@
           <w:lang w:val="en-KE"/>
         </w:rPr>
       </w:pPr>
+      <w:bookmarkStart w:id="6" w:name="_Toc223792149"/>
       <w:r>
         <w:rPr>
           <w:lang w:val="en-KE"/>
         </w:rPr>
         <w:t>1.4 Purpose, Scope, and Application</w:t>
       </w:r>
+      <w:bookmarkEnd w:id="6"/>
     </w:p>
     <w:p>
       <w:pPr>
@@ -778,45 +2701,23 @@
           <w:lang w:val="en-KE"/>
         </w:rPr>
       </w:pPr>
+      <w:bookmarkStart w:id="7" w:name="_Toc223792150"/>
       <w:r>
         <w:rPr>
           <w:lang w:val="en-KE"/>
         </w:rPr>
         <w:t>1.4.1 Purpose</w:t>
       </w:r>
-    </w:p>
-    <w:p>
-      <w:pPr>
-        <w:rPr>
-          <w:lang w:val="en-KE"/>
-        </w:rPr>
-      </w:pPr>
-      <w:r>
-        <w:rPr>
-          <w:lang w:val="en-KE"/>
-        </w:rPr>
-        <w:t xml:space="preserve">The purpose of this project is to </w:t>
-      </w:r>
-      <w:r>
-        <w:rPr>
-          <w:b/>
-          <w:bCs/>
-          <w:lang w:val="en-KE"/>
-        </w:rPr>
-        <w:t xml:space="preserve">create a centralized </w:t>
-      </w:r>
-      <w:r>
-        <w:rPr>
-          <w:b/>
-          <w:bCs/>
-          <w:lang w:val="en-KE"/>
-        </w:rPr>
+      <w:bookmarkEnd w:id="7"/>
+    </w:p>
+    <w:p>
+      <w:r>
+        <w:t xml:space="preserve">The purpose of this project is to create a centralized </w:t>
+      </w:r>
+      <w:r>
         <w:t>student-oriented platform</w:t>
       </w:r>
       <w:r>
-        <w:rPr>
-          <w:lang w:val="en-KE"/>
-        </w:rPr>
         <w:t>, where they can easily collaborate, share knowledge, and access academic resources. Many students face challenges such as lack of timely academic support, difficulty accessing lecture notes, and high costs of academic materials. This platform seeks to bridge these gaps by providing an integrated solution that fosters a collaborative learning environment. By leveraging this platform, students will be able to save time, share resources, and enhance their academic performance.</w:t>
       </w:r>
     </w:p>
@@ -827,12 +2728,14 @@
           <w:lang w:val="en-KE"/>
         </w:rPr>
       </w:pPr>
+      <w:bookmarkStart w:id="8" w:name="_Toc223792151"/>
       <w:r>
         <w:rPr>
           <w:lang w:val="en-KE"/>
         </w:rPr>
         <w:t>1.4.2 Scope</w:t>
       </w:r>
+      <w:bookmarkEnd w:id="8"/>
     </w:p>
     <w:p>
       <w:pPr>
@@ -920,6 +2823,7 @@
         <w:rPr>
           <w:lang w:val="en-KE"/>
         </w:rPr>
+        <w:lastRenderedPageBreak/>
         <w:t>Marketplace for buying, selling, or exchanging used textbooks.</w:t>
       </w:r>
     </w:p>
@@ -956,7 +2860,6 @@
           <w:bCs/>
           <w:lang w:val="en-KE"/>
         </w:rPr>
-        <w:lastRenderedPageBreak/>
         <w:t>Tools and Technologies</w:t>
       </w:r>
       <w:r>
@@ -1155,12 +3058,14 @@
           <w:lang w:val="en-KE"/>
         </w:rPr>
       </w:pPr>
+      <w:bookmarkStart w:id="9" w:name="_Toc223792152"/>
       <w:r>
         <w:rPr>
           <w:lang w:val="en-KE"/>
         </w:rPr>
         <w:t>1.4.3 Application</w:t>
       </w:r>
+      <w:bookmarkEnd w:id="9"/>
     </w:p>
     <w:p>
       <w:pPr>
@@ -1372,6 +3277,7 @@
           <w:lang w:val="en-KE"/>
         </w:rPr>
       </w:pPr>
+      <w:bookmarkStart w:id="10" w:name="_Toc223792153"/>
       <w:r>
         <w:rPr>
           <w:lang w:val="en-KE"/>
@@ -1379,6 +3285,7 @@
         <w:lastRenderedPageBreak/>
         <w:t>CHAPTER 2: LITERATURE REVIEW</w:t>
       </w:r>
+      <w:bookmarkEnd w:id="10"/>
     </w:p>
     <w:p>
       <w:pPr>
@@ -1387,12 +3294,14 @@
           <w:lang w:val="en-KE"/>
         </w:rPr>
       </w:pPr>
+      <w:bookmarkStart w:id="11" w:name="_Toc223792154"/>
       <w:r>
         <w:rPr>
           <w:lang w:val="en-KE"/>
         </w:rPr>
         <w:t>2.1 Introduction</w:t>
       </w:r>
+      <w:bookmarkEnd w:id="11"/>
     </w:p>
     <w:p>
       <w:pPr>
@@ -1482,12 +3391,14 @@
           <w:lang w:val="en-KE"/>
         </w:rPr>
       </w:pPr>
+      <w:bookmarkStart w:id="12" w:name="_Toc223792155"/>
       <w:r>
         <w:rPr>
           <w:lang w:val="en-KE"/>
         </w:rPr>
         <w:t>2.2 Existing Systems in Your Area of Research</w:t>
       </w:r>
+      <w:bookmarkEnd w:id="12"/>
     </w:p>
     <w:p>
       <w:pPr>
@@ -1542,6 +3453,7 @@
           <w:lang w:val="en-KE"/>
         </w:rPr>
       </w:pPr>
+      <w:bookmarkStart w:id="13" w:name="_Toc223792156"/>
       <w:r>
         <w:rPr>
           <w:lang w:val="en-KE"/>
@@ -1554,6 +3466,7 @@
         </w:rPr>
         <w:t>How it Works</w:t>
       </w:r>
+      <w:bookmarkEnd w:id="13"/>
     </w:p>
     <w:p>
       <w:pPr>
@@ -1667,6 +3580,7 @@
           <w:lang w:val="en-KE"/>
         </w:rPr>
       </w:pPr>
+      <w:bookmarkStart w:id="14" w:name="_Toc223792157"/>
       <w:r>
         <w:rPr>
           <w:lang w:val="en-KE"/>
@@ -1679,6 +3593,7 @@
         </w:rPr>
         <w:t>Advantages</w:t>
       </w:r>
+      <w:bookmarkEnd w:id="14"/>
     </w:p>
     <w:p>
       <w:pPr>
@@ -1793,6 +3708,7 @@
           <w:lang w:val="en-KE"/>
         </w:rPr>
       </w:pPr>
+      <w:bookmarkStart w:id="15" w:name="_Toc223792158"/>
       <w:r>
         <w:rPr>
           <w:lang w:val="en-KE"/>
@@ -1805,6 +3721,7 @@
         </w:rPr>
         <w:t>Limitations</w:t>
       </w:r>
+      <w:bookmarkEnd w:id="15"/>
     </w:p>
     <w:p>
       <w:pPr>
@@ -1925,12 +3842,14 @@
           <w:lang w:val="en-KE"/>
         </w:rPr>
       </w:pPr>
+      <w:bookmarkStart w:id="16" w:name="_Toc223792159"/>
       <w:r>
         <w:rPr>
           <w:lang w:val="en-KE"/>
         </w:rPr>
         <w:t>2.3 Existing Software Development Tools</w:t>
       </w:r>
+      <w:bookmarkEnd w:id="16"/>
     </w:p>
     <w:p>
       <w:pPr>
@@ -1952,12 +3871,14 @@
           <w:lang w:val="en-KE"/>
         </w:rPr>
       </w:pPr>
+      <w:bookmarkStart w:id="17" w:name="_Toc223792160"/>
       <w:r>
         <w:rPr>
           <w:lang w:val="en-KE"/>
         </w:rPr>
         <w:t>2.3.1 Software Development Tools</w:t>
       </w:r>
+      <w:bookmarkEnd w:id="17"/>
     </w:p>
     <w:p>
       <w:pPr>
@@ -2000,7 +3921,20 @@
           <w:lang w:val="en-KE"/>
         </w:rPr>
         <w:br/>
-        <w:t>Python is widely used in web development due to its simplicity, readability, and a rich ecosystem of frameworks such as Django and Flask. It supports rapid development and scalability, making it suitable for academic platforms.</w:t>
+      </w:r>
+      <w:proofErr w:type="spellStart"/>
+      <w:r>
+        <w:rPr>
+          <w:lang w:val="en-KE"/>
+        </w:rPr>
+        <w:t>Python</w:t>
+      </w:r>
+      <w:proofErr w:type="spellEnd"/>
+      <w:r>
+        <w:rPr>
+          <w:lang w:val="en-KE"/>
+        </w:rPr>
+        <w:t xml:space="preserve"> is widely used in web development due to its simplicity, readability, and a rich ecosystem of frameworks such as Django and Flask. It supports rapid development and scalability, making it suitable for academic platforms.</w:t>
       </w:r>
     </w:p>
     <w:p>
@@ -2027,7 +3961,20 @@
           <w:lang w:val="en-KE"/>
         </w:rPr>
         <w:br/>
-        <w:t>JavaScript is essential for front-end development, enabling interactive features within web applications. It is often paired with frameworks like React or Vue.js for creating responsive user interfaces.</w:t>
+      </w:r>
+      <w:proofErr w:type="spellStart"/>
+      <w:r>
+        <w:rPr>
+          <w:lang w:val="en-KE"/>
+        </w:rPr>
+        <w:t>JavaScript</w:t>
+      </w:r>
+      <w:proofErr w:type="spellEnd"/>
+      <w:r>
+        <w:rPr>
+          <w:lang w:val="en-KE"/>
+        </w:rPr>
+        <w:t xml:space="preserve"> is essential for front-end development, enabling interactive features within web applications. It is often paired with frameworks like React or Vue.js for creating responsive user interfaces.</w:t>
       </w:r>
     </w:p>
     <w:p>
@@ -2136,7 +4083,20 @@
           <w:lang w:val="en-KE"/>
         </w:rPr>
         <w:br/>
-        <w:t>PostgreSQL is an open-source, advanced relational database system known for reliability, performance, and support for JSON data types. It is well-suited for storing structured and semi-structured data such as questions, answers, and course references.</w:t>
+      </w:r>
+      <w:proofErr w:type="spellStart"/>
+      <w:r>
+        <w:rPr>
+          <w:lang w:val="en-KE"/>
+        </w:rPr>
+        <w:t>PostgreSQL</w:t>
+      </w:r>
+      <w:proofErr w:type="spellEnd"/>
+      <w:r>
+        <w:rPr>
+          <w:lang w:val="en-KE"/>
+        </w:rPr>
+        <w:t xml:space="preserve"> is an open-source, advanced relational database system known for reliability, performance, and support for JSON data types. It is well-suited for storing structured and semi-structured data such as questions, answers, and course references.</w:t>
       </w:r>
     </w:p>
     <w:p>
@@ -2180,7 +4140,20 @@
           <w:lang w:val="en-KE"/>
         </w:rPr>
         <w:br/>
-        <w:t>Trello is a visual project management tool that allows developers to organize tasks into boards and cards for better collaboration and tracking progress.</w:t>
+      </w:r>
+      <w:proofErr w:type="spellStart"/>
+      <w:r>
+        <w:rPr>
+          <w:lang w:val="en-KE"/>
+        </w:rPr>
+        <w:t>Trello</w:t>
+      </w:r>
+      <w:proofErr w:type="spellEnd"/>
+      <w:r>
+        <w:rPr>
+          <w:lang w:val="en-KE"/>
+        </w:rPr>
+        <w:t xml:space="preserve"> is a visual project management tool that allows developers to organize tasks into boards and cards for better collaboration and tracking progress.</w:t>
       </w:r>
     </w:p>
     <w:p>
@@ -2207,7 +4180,20 @@
           <w:lang w:val="en-KE"/>
         </w:rPr>
         <w:br/>
-        <w:t>GitHub is a version control platform based on Git, enabling multiple developers to collaborate, track changes, and manage code efficiently.</w:t>
+      </w:r>
+      <w:proofErr w:type="spellStart"/>
+      <w:r>
+        <w:rPr>
+          <w:lang w:val="en-KE"/>
+        </w:rPr>
+        <w:t>GitHub</w:t>
+      </w:r>
+      <w:proofErr w:type="spellEnd"/>
+      <w:r>
+        <w:rPr>
+          <w:lang w:val="en-KE"/>
+        </w:rPr>
+        <w:t xml:space="preserve"> is a version control platform based on Git, enabling multiple developers to collaborate, track changes, and manage code efficiently.</w:t>
       </w:r>
     </w:p>
     <w:p>
@@ -2224,6 +4210,7 @@
           <w:lang w:val="en-KE"/>
         </w:rPr>
       </w:pPr>
+      <w:bookmarkStart w:id="18" w:name="_Toc223792161"/>
       <w:r>
         <w:rPr>
           <w:lang w:val="en-KE"/>
@@ -2236,6 +4223,7 @@
         </w:rPr>
         <w:t>Advantages of These Tools</w:t>
       </w:r>
+      <w:bookmarkEnd w:id="18"/>
     </w:p>
     <w:p>
       <w:pPr>
@@ -2296,6 +4284,7 @@
           <w:lang w:val="en-KE"/>
         </w:rPr>
       </w:pPr>
+      <w:bookmarkStart w:id="19" w:name="_Toc223792162"/>
       <w:r>
         <w:rPr>
           <w:lang w:val="en-KE"/>
@@ -2308,6 +4297,7 @@
         </w:rPr>
         <w:t>Limitations</w:t>
       </w:r>
+      <w:bookmarkEnd w:id="19"/>
     </w:p>
     <w:p>
       <w:pPr>
@@ -2367,12 +4357,14 @@
           <w:lang w:val="en-KE"/>
         </w:rPr>
       </w:pPr>
+      <w:bookmarkStart w:id="20" w:name="_Toc223792163"/>
       <w:r>
         <w:rPr>
           <w:lang w:val="en-KE"/>
         </w:rPr>
         <w:t>2.4 Evaluation Matrix</w:t>
       </w:r>
+      <w:bookmarkEnd w:id="20"/>
     </w:p>
     <w:p>
       <w:pPr>
@@ -3161,12 +5153,14 @@
           <w:lang w:val="en-KE"/>
         </w:rPr>
       </w:pPr>
+      <w:bookmarkStart w:id="21" w:name="_Toc223792164"/>
       <w:r>
         <w:rPr>
           <w:lang w:val="en-KE"/>
         </w:rPr>
         <w:t>2.5 Conclusion</w:t>
       </w:r>
+      <w:bookmarkEnd w:id="21"/>
     </w:p>
     <w:p>
       <w:pPr>
@@ -3236,30 +5230,48 @@
       <w:pPr>
         <w:pStyle w:val="Heading1"/>
       </w:pPr>
+      <w:bookmarkStart w:id="22" w:name="_Toc223792165"/>
       <w:r>
         <w:lastRenderedPageBreak/>
         <w:t>CHAPTER 3: RESEARCH METHODOLOGY</w:t>
       </w:r>
+      <w:bookmarkEnd w:id="22"/>
     </w:p>
     <w:p>
       <w:pPr>
         <w:pStyle w:val="Heading2"/>
       </w:pPr>
+      <w:bookmarkStart w:id="23" w:name="_Toc223792166"/>
       <w:r>
         <w:t>3.1 Introduction</w:t>
       </w:r>
-    </w:p>
-    <w:p>
-      <w:pPr>
-        <w:rPr>
-          <w:lang w:val="en-KE"/>
-        </w:rPr>
-      </w:pPr>
-      <w:r>
-        <w:rPr>
-          <w:lang w:val="en-KE"/>
-        </w:rPr>
-        <w:t>This chapter outlines the research methodology adopted to develop the proposed academic platform. Research methodology refers to the systematic approach used to collect, analyze, and interpret information to achieve the objectives of the study. The purpose of this chapter is to describe the design and methods that will be employed to ensure the system is effectively developed and meets the identified needs.</w:t>
+      <w:bookmarkEnd w:id="23"/>
+    </w:p>
+    <w:p>
+      <w:pPr>
+        <w:rPr>
+          <w:lang w:val="en-KE"/>
+        </w:rPr>
+      </w:pPr>
+      <w:r>
+        <w:rPr>
+          <w:lang w:val="en-KE"/>
+        </w:rPr>
+        <w:t xml:space="preserve">This chapter outlines the research methodology adopted to develop the proposed academic platform. Research methodology refers to the systematic approach used to collect, </w:t>
+      </w:r>
+      <w:proofErr w:type="spellStart"/>
+      <w:r>
+        <w:rPr>
+          <w:lang w:val="en-KE"/>
+        </w:rPr>
+        <w:t>analyze</w:t>
+      </w:r>
+      <w:proofErr w:type="spellEnd"/>
+      <w:r>
+        <w:rPr>
+          <w:lang w:val="en-KE"/>
+        </w:rPr>
+        <w:t>, and interpret information to achieve the objectives of the study. The purpose of this chapter is to describe the design and methods that will be employed to ensure the system is effectively developed and meets the identified needs.</w:t>
       </w:r>
     </w:p>
     <w:p>
@@ -3337,12 +5349,14 @@
           <w:lang w:val="en-KE"/>
         </w:rPr>
       </w:pPr>
+      <w:bookmarkStart w:id="24" w:name="_Toc223792167"/>
       <w:r>
         <w:rPr>
           <w:lang w:val="en-KE"/>
         </w:rPr>
         <w:t>3.2 Research Process</w:t>
       </w:r>
+      <w:bookmarkEnd w:id="24"/>
     </w:p>
     <w:p>
       <w:pPr>
@@ -3405,7 +5419,20 @@
           <w:lang w:val="en-KE"/>
         </w:rPr>
         <w:br/>
-        <w:t>Analyze the issues in existing systems and understand the challenges faced by students in accessing academic resources and forming study groups.</w:t>
+      </w:r>
+      <w:proofErr w:type="spellStart"/>
+      <w:r>
+        <w:rPr>
+          <w:lang w:val="en-KE"/>
+        </w:rPr>
+        <w:t>Analyze</w:t>
+      </w:r>
+      <w:proofErr w:type="spellEnd"/>
+      <w:r>
+        <w:rPr>
+          <w:lang w:val="en-KE"/>
+        </w:rPr>
+        <w:t xml:space="preserve"> the issues in existing systems and understand the challenges faced by students in accessing academic resources and forming study groups.</w:t>
       </w:r>
     </w:p>
     <w:p>
@@ -3823,12 +5850,14 @@
           <w:lang w:val="en-KE"/>
         </w:rPr>
       </w:pPr>
+      <w:bookmarkStart w:id="25" w:name="_Toc223792168"/>
       <w:r>
         <w:rPr>
           <w:lang w:val="en-KE"/>
         </w:rPr>
         <w:t>3.3 System Development Life Cycle (SDLC)</w:t>
       </w:r>
+      <w:bookmarkEnd w:id="25"/>
     </w:p>
     <w:p>
       <w:pPr>
@@ -3854,7 +5883,21 @@
         <w:rPr>
           <w:lang w:val="en-KE"/>
         </w:rPr>
-        <w:t xml:space="preserve"> was adopted because of its flexibility, iterative nature, and ability to incorporate continuous user feedback, which is essential for building a student-centered platform.</w:t>
+        <w:t xml:space="preserve"> was adopted because of its flexibility, iterative nature, and ability to incorporate continuous user feedback, which is essential for building a student-</w:t>
+      </w:r>
+      <w:proofErr w:type="spellStart"/>
+      <w:r>
+        <w:rPr>
+          <w:lang w:val="en-KE"/>
+        </w:rPr>
+        <w:t>centered</w:t>
+      </w:r>
+      <w:proofErr w:type="spellEnd"/>
+      <w:r>
+        <w:rPr>
+          <w:lang w:val="en-KE"/>
+        </w:rPr>
+        <w:t xml:space="preserve"> platform.</w:t>
       </w:r>
     </w:p>
     <w:p>
@@ -3864,12 +5907,14 @@
           <w:lang w:val="en-KE"/>
         </w:rPr>
       </w:pPr>
+      <w:bookmarkStart w:id="26" w:name="_Toc223792169"/>
       <w:r>
         <w:rPr>
           <w:lang w:val="en-KE"/>
         </w:rPr>
         <w:t>3.3.1 Agile Model Overview</w:t>
       </w:r>
+      <w:bookmarkEnd w:id="26"/>
     </w:p>
     <w:p>
       <w:pPr>
@@ -4013,12 +6058,14 @@
           <w:lang w:val="en-KE"/>
         </w:rPr>
       </w:pPr>
+      <w:bookmarkStart w:id="27" w:name="_Toc223792170"/>
       <w:r>
         <w:rPr>
           <w:lang w:val="en-KE"/>
         </w:rPr>
         <w:t>3.3.2 Agile Process Steps</w:t>
       </w:r>
+      <w:bookmarkEnd w:id="27"/>
     </w:p>
     <w:p>
       <w:pPr>
@@ -4102,7 +6149,21 @@
         <w:rPr>
           <w:lang w:val="en-KE"/>
         </w:rPr>
-        <w:t>Create wireframes, UI mockups, and database schema for prioritized features.</w:t>
+        <w:t xml:space="preserve">Create wireframes, UI </w:t>
+      </w:r>
+      <w:proofErr w:type="spellStart"/>
+      <w:r>
+        <w:rPr>
+          <w:lang w:val="en-KE"/>
+        </w:rPr>
+        <w:t>mockups</w:t>
+      </w:r>
+      <w:proofErr w:type="spellEnd"/>
+      <w:r>
+        <w:rPr>
+          <w:lang w:val="en-KE"/>
+        </w:rPr>
+        <w:t>, and database schema for prioritized features.</w:t>
       </w:r>
     </w:p>
     <w:p>
@@ -4369,6 +6430,7 @@
           <w:lang w:val="en-KE"/>
         </w:rPr>
       </w:pPr>
+      <w:bookmarkStart w:id="28" w:name="_Toc223792171"/>
       <w:r>
         <w:rPr>
           <w:lang w:val="en-KE"/>
@@ -4376,6 +6438,7 @@
         <w:lastRenderedPageBreak/>
         <w:t>3.3.3 Agile Model Diagram</w:t>
       </w:r>
+      <w:bookmarkEnd w:id="28"/>
     </w:p>
     <w:p>
       <w:pPr>
@@ -4687,7 +6750,21 @@
         <w:rPr>
           <w:lang w:val="en-KE"/>
         </w:rPr>
-        <w:t xml:space="preserve">          |  Deployment       |</w:t>
+        <w:t xml:space="preserve">          </w:t>
+      </w:r>
+      <w:proofErr w:type="gramStart"/>
+      <w:r>
+        <w:rPr>
+          <w:lang w:val="en-KE"/>
+        </w:rPr>
+        <w:t>|  Deployment</w:t>
+      </w:r>
+      <w:proofErr w:type="gramEnd"/>
+      <w:r>
+        <w:rPr>
+          <w:lang w:val="en-KE"/>
+        </w:rPr>
+        <w:t xml:space="preserve">       |</w:t>
       </w:r>
     </w:p>
     <w:p>
@@ -4739,7 +6816,21 @@
         <w:rPr>
           <w:lang w:val="en-KE"/>
         </w:rPr>
-        <w:t xml:space="preserve">          |  Maintenance      |</w:t>
+        <w:t xml:space="preserve">          </w:t>
+      </w:r>
+      <w:proofErr w:type="gramStart"/>
+      <w:r>
+        <w:rPr>
+          <w:lang w:val="en-KE"/>
+        </w:rPr>
+        <w:t>|  Maintenance</w:t>
+      </w:r>
+      <w:proofErr w:type="gramEnd"/>
+      <w:r>
+        <w:rPr>
+          <w:lang w:val="en-KE"/>
+        </w:rPr>
+        <w:t xml:space="preserve">      |</w:t>
       </w:r>
     </w:p>
     <w:p>
@@ -4802,12 +6893,14 @@
           <w:lang w:val="en-KE"/>
         </w:rPr>
       </w:pPr>
+      <w:bookmarkStart w:id="29" w:name="_Toc223792172"/>
       <w:r>
         <w:rPr>
           <w:lang w:val="en-KE"/>
         </w:rPr>
         <w:t>3.3.4 Justification for Choosing Agile</w:t>
       </w:r>
+      <w:bookmarkEnd w:id="29"/>
     </w:p>
     <w:p>
       <w:pPr>
@@ -4916,9 +7009,11 @@
       <w:pPr>
         <w:pStyle w:val="Heading2"/>
       </w:pPr>
+      <w:bookmarkStart w:id="30" w:name="_Toc223792173"/>
       <w:r>
         <w:t>3.4 Conclusion</w:t>
       </w:r>
+      <w:bookmarkEnd w:id="30"/>
     </w:p>
     <w:p>
       <w:pPr>
@@ -4997,7 +7092,21 @@
         <w:rPr>
           <w:lang w:val="en-KE"/>
         </w:rPr>
-        <w:t xml:space="preserve"> provided the foundation for gathering relevant information, analyzing existing systems such as </w:t>
+        <w:t xml:space="preserve"> provided the foundation for gathering relevant information, </w:t>
+      </w:r>
+      <w:proofErr w:type="spellStart"/>
+      <w:r>
+        <w:rPr>
+          <w:lang w:val="en-KE"/>
+        </w:rPr>
+        <w:t>analyzing</w:t>
+      </w:r>
+      <w:proofErr w:type="spellEnd"/>
+      <w:r>
+        <w:rPr>
+          <w:lang w:val="en-KE"/>
+        </w:rPr>
+        <w:t xml:space="preserve"> existing systems such as </w:t>
       </w:r>
       <w:r>
         <w:rPr>
@@ -5065,7 +7174,21 @@
         <w:rPr>
           <w:lang w:val="en-KE"/>
         </w:rPr>
-        <w:t>Overall, the combination of these methodologies guarantees a user-centered solution that is adaptable, efficient, and capable of delivering a reliable platform for academic quizzes and knowledge sharing.</w:t>
+        <w:t>Overall, the combination of these methodologies guarantees a user-</w:t>
+      </w:r>
+      <w:proofErr w:type="spellStart"/>
+      <w:r>
+        <w:rPr>
+          <w:lang w:val="en-KE"/>
+        </w:rPr>
+        <w:t>centered</w:t>
+      </w:r>
+      <w:proofErr w:type="spellEnd"/>
+      <w:r>
+        <w:rPr>
+          <w:lang w:val="en-KE"/>
+        </w:rPr>
+        <w:t xml:space="preserve"> solution that is adaptable, efficient, and capable of delivering a reliable platform for academic quizzes and knowledge sharing.</w:t>
       </w:r>
     </w:p>
     <w:p/>
@@ -5080,10 +7203,12 @@
       <w:pPr>
         <w:pStyle w:val="Heading1"/>
       </w:pPr>
+      <w:bookmarkStart w:id="31" w:name="_Toc223792174"/>
       <w:r>
         <w:lastRenderedPageBreak/>
         <w:t>CHAPTER 4: SYSTEM DESIGN, IMPLEMENTATION AND TESTING</w:t>
       </w:r>
+      <w:bookmarkEnd w:id="31"/>
     </w:p>
     <w:p/>
     <w:p/>
@@ -6257,6 +8382,92 @@
     </w:lvl>
   </w:abstractNum>
   <w:abstractNum w:abstractNumId="7" w15:restartNumberingAfterBreak="0">
+    <w:nsid w:val="26BB179B"/>
+    <w:multiLevelType w:val="hybridMultilevel"/>
+    <w:tmpl w:val="B2BC80D0"/>
+    <w:lvl w:ilvl="0" w:tplc="2000000F">
+      <w:start w:val="1"/>
+      <w:numFmt w:val="decimal"/>
+      <w:lvlText w:val="%1."/>
+      <w:lvlJc w:val="left"/>
+      <w:pPr>
+        <w:ind w:left="720" w:hanging="360"/>
+      </w:pPr>
+    </w:lvl>
+    <w:lvl w:ilvl="1" w:tplc="20000019" w:tentative="1">
+      <w:start w:val="1"/>
+      <w:numFmt w:val="lowerLetter"/>
+      <w:lvlText w:val="%2."/>
+      <w:lvlJc w:val="left"/>
+      <w:pPr>
+        <w:ind w:left="1440" w:hanging="360"/>
+      </w:pPr>
+    </w:lvl>
+    <w:lvl w:ilvl="2" w:tplc="2000001B" w:tentative="1">
+      <w:start w:val="1"/>
+      <w:numFmt w:val="lowerRoman"/>
+      <w:lvlText w:val="%3."/>
+      <w:lvlJc w:val="right"/>
+      <w:pPr>
+        <w:ind w:left="2160" w:hanging="180"/>
+      </w:pPr>
+    </w:lvl>
+    <w:lvl w:ilvl="3" w:tplc="2000000F" w:tentative="1">
+      <w:start w:val="1"/>
+      <w:numFmt w:val="decimal"/>
+      <w:lvlText w:val="%4."/>
+      <w:lvlJc w:val="left"/>
+      <w:pPr>
+        <w:ind w:left="2880" w:hanging="360"/>
+      </w:pPr>
+    </w:lvl>
+    <w:lvl w:ilvl="4" w:tplc="20000019" w:tentative="1">
+      <w:start w:val="1"/>
+      <w:numFmt w:val="lowerLetter"/>
+      <w:lvlText w:val="%5."/>
+      <w:lvlJc w:val="left"/>
+      <w:pPr>
+        <w:ind w:left="3600" w:hanging="360"/>
+      </w:pPr>
+    </w:lvl>
+    <w:lvl w:ilvl="5" w:tplc="2000001B" w:tentative="1">
+      <w:start w:val="1"/>
+      <w:numFmt w:val="lowerRoman"/>
+      <w:lvlText w:val="%6."/>
+      <w:lvlJc w:val="right"/>
+      <w:pPr>
+        <w:ind w:left="4320" w:hanging="180"/>
+      </w:pPr>
+    </w:lvl>
+    <w:lvl w:ilvl="6" w:tplc="2000000F" w:tentative="1">
+      <w:start w:val="1"/>
+      <w:numFmt w:val="decimal"/>
+      <w:lvlText w:val="%7."/>
+      <w:lvlJc w:val="left"/>
+      <w:pPr>
+        <w:ind w:left="5040" w:hanging="360"/>
+      </w:pPr>
+    </w:lvl>
+    <w:lvl w:ilvl="7" w:tplc="20000019" w:tentative="1">
+      <w:start w:val="1"/>
+      <w:numFmt w:val="lowerLetter"/>
+      <w:lvlText w:val="%8."/>
+      <w:lvlJc w:val="left"/>
+      <w:pPr>
+        <w:ind w:left="5760" w:hanging="360"/>
+      </w:pPr>
+    </w:lvl>
+    <w:lvl w:ilvl="8" w:tplc="2000001B" w:tentative="1">
+      <w:start w:val="1"/>
+      <w:numFmt w:val="lowerRoman"/>
+      <w:lvlText w:val="%9."/>
+      <w:lvlJc w:val="right"/>
+      <w:pPr>
+        <w:ind w:left="6480" w:hanging="180"/>
+      </w:pPr>
+    </w:lvl>
+  </w:abstractNum>
+  <w:abstractNum w:abstractNumId="8" w15:restartNumberingAfterBreak="0">
     <w:nsid w:val="39053C0D"/>
     <w:multiLevelType w:val="multilevel"/>
     <w:tmpl w:val="0B5AE402"/>
@@ -6405,7 +8616,7 @@
       </w:rPr>
     </w:lvl>
   </w:abstractNum>
-  <w:abstractNum w:abstractNumId="8" w15:restartNumberingAfterBreak="0">
+  <w:abstractNum w:abstractNumId="9" w15:restartNumberingAfterBreak="0">
     <w:nsid w:val="39F075B7"/>
     <w:multiLevelType w:val="multilevel"/>
     <w:tmpl w:val="A0763E1A"/>
@@ -6554,7 +8765,7 @@
       </w:rPr>
     </w:lvl>
   </w:abstractNum>
-  <w:abstractNum w:abstractNumId="9" w15:restartNumberingAfterBreak="0">
+  <w:abstractNum w:abstractNumId="10" w15:restartNumberingAfterBreak="0">
     <w:nsid w:val="40900AC7"/>
     <w:multiLevelType w:val="multilevel"/>
     <w:tmpl w:val="3AE00EB0"/>
@@ -6667,7 +8878,7 @@
       </w:pPr>
     </w:lvl>
   </w:abstractNum>
-  <w:abstractNum w:abstractNumId="10" w15:restartNumberingAfterBreak="0">
+  <w:abstractNum w:abstractNumId="11" w15:restartNumberingAfterBreak="0">
     <w:nsid w:val="41580609"/>
     <w:multiLevelType w:val="multilevel"/>
     <w:tmpl w:val="5A861F1E"/>
@@ -6816,7 +9027,7 @@
       </w:rPr>
     </w:lvl>
   </w:abstractNum>
-  <w:abstractNum w:abstractNumId="11" w15:restartNumberingAfterBreak="0">
+  <w:abstractNum w:abstractNumId="12" w15:restartNumberingAfterBreak="0">
     <w:nsid w:val="4C855479"/>
     <w:multiLevelType w:val="multilevel"/>
     <w:tmpl w:val="B724773C"/>
@@ -6929,7 +9140,7 @@
       </w:pPr>
     </w:lvl>
   </w:abstractNum>
-  <w:abstractNum w:abstractNumId="12" w15:restartNumberingAfterBreak="0">
+  <w:abstractNum w:abstractNumId="13" w15:restartNumberingAfterBreak="0">
     <w:nsid w:val="503E1241"/>
     <w:multiLevelType w:val="multilevel"/>
     <w:tmpl w:val="1214F92E"/>
@@ -7042,7 +9253,7 @@
       </w:pPr>
     </w:lvl>
   </w:abstractNum>
-  <w:abstractNum w:abstractNumId="13" w15:restartNumberingAfterBreak="0">
+  <w:abstractNum w:abstractNumId="14" w15:restartNumberingAfterBreak="0">
     <w:nsid w:val="523D408C"/>
     <w:multiLevelType w:val="multilevel"/>
     <w:tmpl w:val="DE6213EE"/>
@@ -7191,7 +9402,7 @@
       </w:rPr>
     </w:lvl>
   </w:abstractNum>
-  <w:abstractNum w:abstractNumId="14" w15:restartNumberingAfterBreak="0">
+  <w:abstractNum w:abstractNumId="15" w15:restartNumberingAfterBreak="0">
     <w:nsid w:val="52B81F37"/>
     <w:multiLevelType w:val="hybridMultilevel"/>
     <w:tmpl w:val="6D446350"/>
@@ -7304,7 +9515,7 @@
       </w:rPr>
     </w:lvl>
   </w:abstractNum>
-  <w:abstractNum w:abstractNumId="15" w15:restartNumberingAfterBreak="0">
+  <w:abstractNum w:abstractNumId="16" w15:restartNumberingAfterBreak="0">
     <w:nsid w:val="567F15D5"/>
     <w:multiLevelType w:val="multilevel"/>
     <w:tmpl w:val="5C9894A8"/>
@@ -7453,7 +9664,7 @@
       </w:rPr>
     </w:lvl>
   </w:abstractNum>
-  <w:abstractNum w:abstractNumId="16" w15:restartNumberingAfterBreak="0">
+  <w:abstractNum w:abstractNumId="17" w15:restartNumberingAfterBreak="0">
     <w:nsid w:val="596D7C6C"/>
     <w:multiLevelType w:val="hybridMultilevel"/>
     <w:tmpl w:val="29B67F3E"/>
@@ -7566,7 +9777,7 @@
       </w:rPr>
     </w:lvl>
   </w:abstractNum>
-  <w:abstractNum w:abstractNumId="17" w15:restartNumberingAfterBreak="0">
+  <w:abstractNum w:abstractNumId="18" w15:restartNumberingAfterBreak="0">
     <w:nsid w:val="64607130"/>
     <w:multiLevelType w:val="multilevel"/>
     <w:tmpl w:val="4170E9D8"/>
@@ -7679,7 +9890,7 @@
       </w:pPr>
     </w:lvl>
   </w:abstractNum>
-  <w:abstractNum w:abstractNumId="18" w15:restartNumberingAfterBreak="0">
+  <w:abstractNum w:abstractNumId="19" w15:restartNumberingAfterBreak="0">
     <w:nsid w:val="67160E31"/>
     <w:multiLevelType w:val="hybridMultilevel"/>
     <w:tmpl w:val="2E12E956"/>
@@ -7792,7 +10003,7 @@
       </w:rPr>
     </w:lvl>
   </w:abstractNum>
-  <w:abstractNum w:abstractNumId="19" w15:restartNumberingAfterBreak="0">
+  <w:abstractNum w:abstractNumId="20" w15:restartNumberingAfterBreak="0">
     <w:nsid w:val="671731F0"/>
     <w:multiLevelType w:val="multilevel"/>
     <w:tmpl w:val="E2A43752"/>
@@ -7941,7 +10152,7 @@
       </w:rPr>
     </w:lvl>
   </w:abstractNum>
-  <w:abstractNum w:abstractNumId="20" w15:restartNumberingAfterBreak="0">
+  <w:abstractNum w:abstractNumId="21" w15:restartNumberingAfterBreak="0">
     <w:nsid w:val="67561112"/>
     <w:multiLevelType w:val="multilevel"/>
     <w:tmpl w:val="32729FA8"/>
@@ -8054,7 +10265,7 @@
       </w:rPr>
     </w:lvl>
   </w:abstractNum>
-  <w:abstractNum w:abstractNumId="21" w15:restartNumberingAfterBreak="0">
+  <w:abstractNum w:abstractNumId="22" w15:restartNumberingAfterBreak="0">
     <w:nsid w:val="6D594AF7"/>
     <w:multiLevelType w:val="multilevel"/>
     <w:tmpl w:val="6CDC9F3A"/>
@@ -8203,41 +10414,154 @@
       </w:rPr>
     </w:lvl>
   </w:abstractNum>
+  <w:abstractNum w:abstractNumId="23" w15:restartNumberingAfterBreak="0">
+    <w:nsid w:val="70566507"/>
+    <w:multiLevelType w:val="hybridMultilevel"/>
+    <w:tmpl w:val="1674D4B0"/>
+    <w:lvl w:ilvl="0" w:tplc="20000001">
+      <w:start w:val="1"/>
+      <w:numFmt w:val="bullet"/>
+      <w:lvlText w:val=""/>
+      <w:lvlJc w:val="left"/>
+      <w:pPr>
+        <w:ind w:left="720" w:hanging="360"/>
+      </w:pPr>
+      <w:rPr>
+        <w:rFonts w:ascii="Symbol" w:hAnsi="Symbol" w:hint="default"/>
+      </w:rPr>
+    </w:lvl>
+    <w:lvl w:ilvl="1" w:tplc="20000003" w:tentative="1">
+      <w:start w:val="1"/>
+      <w:numFmt w:val="bullet"/>
+      <w:lvlText w:val="o"/>
+      <w:lvlJc w:val="left"/>
+      <w:pPr>
+        <w:ind w:left="1440" w:hanging="360"/>
+      </w:pPr>
+      <w:rPr>
+        <w:rFonts w:ascii="Courier New" w:hAnsi="Courier New" w:cs="Courier New" w:hint="default"/>
+      </w:rPr>
+    </w:lvl>
+    <w:lvl w:ilvl="2" w:tplc="20000005" w:tentative="1">
+      <w:start w:val="1"/>
+      <w:numFmt w:val="bullet"/>
+      <w:lvlText w:val=""/>
+      <w:lvlJc w:val="left"/>
+      <w:pPr>
+        <w:ind w:left="2160" w:hanging="360"/>
+      </w:pPr>
+      <w:rPr>
+        <w:rFonts w:ascii="Wingdings" w:hAnsi="Wingdings" w:hint="default"/>
+      </w:rPr>
+    </w:lvl>
+    <w:lvl w:ilvl="3" w:tplc="20000001" w:tentative="1">
+      <w:start w:val="1"/>
+      <w:numFmt w:val="bullet"/>
+      <w:lvlText w:val=""/>
+      <w:lvlJc w:val="left"/>
+      <w:pPr>
+        <w:ind w:left="2880" w:hanging="360"/>
+      </w:pPr>
+      <w:rPr>
+        <w:rFonts w:ascii="Symbol" w:hAnsi="Symbol" w:hint="default"/>
+      </w:rPr>
+    </w:lvl>
+    <w:lvl w:ilvl="4" w:tplc="20000003" w:tentative="1">
+      <w:start w:val="1"/>
+      <w:numFmt w:val="bullet"/>
+      <w:lvlText w:val="o"/>
+      <w:lvlJc w:val="left"/>
+      <w:pPr>
+        <w:ind w:left="3600" w:hanging="360"/>
+      </w:pPr>
+      <w:rPr>
+        <w:rFonts w:ascii="Courier New" w:hAnsi="Courier New" w:cs="Courier New" w:hint="default"/>
+      </w:rPr>
+    </w:lvl>
+    <w:lvl w:ilvl="5" w:tplc="20000005" w:tentative="1">
+      <w:start w:val="1"/>
+      <w:numFmt w:val="bullet"/>
+      <w:lvlText w:val=""/>
+      <w:lvlJc w:val="left"/>
+      <w:pPr>
+        <w:ind w:left="4320" w:hanging="360"/>
+      </w:pPr>
+      <w:rPr>
+        <w:rFonts w:ascii="Wingdings" w:hAnsi="Wingdings" w:hint="default"/>
+      </w:rPr>
+    </w:lvl>
+    <w:lvl w:ilvl="6" w:tplc="20000001" w:tentative="1">
+      <w:start w:val="1"/>
+      <w:numFmt w:val="bullet"/>
+      <w:lvlText w:val=""/>
+      <w:lvlJc w:val="left"/>
+      <w:pPr>
+        <w:ind w:left="5040" w:hanging="360"/>
+      </w:pPr>
+      <w:rPr>
+        <w:rFonts w:ascii="Symbol" w:hAnsi="Symbol" w:hint="default"/>
+      </w:rPr>
+    </w:lvl>
+    <w:lvl w:ilvl="7" w:tplc="20000003" w:tentative="1">
+      <w:start w:val="1"/>
+      <w:numFmt w:val="bullet"/>
+      <w:lvlText w:val="o"/>
+      <w:lvlJc w:val="left"/>
+      <w:pPr>
+        <w:ind w:left="5760" w:hanging="360"/>
+      </w:pPr>
+      <w:rPr>
+        <w:rFonts w:ascii="Courier New" w:hAnsi="Courier New" w:cs="Courier New" w:hint="default"/>
+      </w:rPr>
+    </w:lvl>
+    <w:lvl w:ilvl="8" w:tplc="20000005" w:tentative="1">
+      <w:start w:val="1"/>
+      <w:numFmt w:val="bullet"/>
+      <w:lvlText w:val=""/>
+      <w:lvlJc w:val="left"/>
+      <w:pPr>
+        <w:ind w:left="6480" w:hanging="360"/>
+      </w:pPr>
+      <w:rPr>
+        <w:rFonts w:ascii="Wingdings" w:hAnsi="Wingdings" w:hint="default"/>
+      </w:rPr>
+    </w:lvl>
+  </w:abstractNum>
   <w:num w:numId="1" w16cid:durableId="744307171">
-    <w:abstractNumId w:val="20"/>
+    <w:abstractNumId w:val="21"/>
   </w:num>
   <w:num w:numId="2" w16cid:durableId="143669958">
-    <w:abstractNumId w:val="10"/>
+    <w:abstractNumId w:val="11"/>
   </w:num>
   <w:num w:numId="3" w16cid:durableId="1700356711">
-    <w:abstractNumId w:val="9"/>
+    <w:abstractNumId w:val="10"/>
   </w:num>
   <w:num w:numId="4" w16cid:durableId="905843325">
     <w:abstractNumId w:val="1"/>
   </w:num>
   <w:num w:numId="5" w16cid:durableId="2132941858">
-    <w:abstractNumId w:val="21"/>
+    <w:abstractNumId w:val="22"/>
   </w:num>
   <w:num w:numId="6" w16cid:durableId="1855265965">
+    <w:abstractNumId w:val="14"/>
+  </w:num>
+  <w:num w:numId="7" w16cid:durableId="2097170061">
     <w:abstractNumId w:val="13"/>
   </w:num>
-  <w:num w:numId="7" w16cid:durableId="2097170061">
+  <w:num w:numId="8" w16cid:durableId="1838498354">
     <w:abstractNumId w:val="12"/>
   </w:num>
-  <w:num w:numId="8" w16cid:durableId="1838498354">
-    <w:abstractNumId w:val="11"/>
+  <w:num w:numId="9" w16cid:durableId="1714577062">
+    <w:abstractNumId w:val="9"/>
   </w:num>
-  <w:num w:numId="9" w16cid:durableId="1714577062">
+  <w:num w:numId="10" w16cid:durableId="1269852575">
+    <w:abstractNumId w:val="16"/>
+  </w:num>
+  <w:num w:numId="11" w16cid:durableId="1627278770">
     <w:abstractNumId w:val="8"/>
   </w:num>
-  <w:num w:numId="10" w16cid:durableId="1269852575">
-    <w:abstractNumId w:val="15"/>
-  </w:num>
-  <w:num w:numId="11" w16cid:durableId="1627278770">
-    <w:abstractNumId w:val="7"/>
-  </w:num>
   <w:num w:numId="12" w16cid:durableId="1335912051">
-    <w:abstractNumId w:val="19"/>
+    <w:abstractNumId w:val="20"/>
   </w:num>
   <w:num w:numId="13" w16cid:durableId="504247339">
     <w:abstractNumId w:val="4"/>
@@ -8246,19 +10570,19 @@
     <w:abstractNumId w:val="0"/>
   </w:num>
   <w:num w:numId="15" w16cid:durableId="1629627573">
-    <w:abstractNumId w:val="18"/>
+    <w:abstractNumId w:val="19"/>
   </w:num>
   <w:num w:numId="16" w16cid:durableId="1169323828">
-    <w:abstractNumId w:val="16"/>
+    <w:abstractNumId w:val="17"/>
   </w:num>
   <w:num w:numId="17" w16cid:durableId="992638965">
-    <w:abstractNumId w:val="14"/>
+    <w:abstractNumId w:val="15"/>
   </w:num>
   <w:num w:numId="18" w16cid:durableId="439302138">
     <w:abstractNumId w:val="5"/>
   </w:num>
   <w:num w:numId="19" w16cid:durableId="1581669156">
-    <w:abstractNumId w:val="17"/>
+    <w:abstractNumId w:val="18"/>
   </w:num>
   <w:num w:numId="20" w16cid:durableId="1066150147">
     <w:abstractNumId w:val="6"/>
@@ -8268,6 +10592,12 @@
   </w:num>
   <w:num w:numId="22" w16cid:durableId="1886915259">
     <w:abstractNumId w:val="2"/>
+  </w:num>
+  <w:num w:numId="23" w16cid:durableId="705758857">
+    <w:abstractNumId w:val="23"/>
+  </w:num>
+  <w:num w:numId="24" w16cid:durableId="1283076386">
+    <w:abstractNumId w:val="7"/>
   </w:num>
 </w:numbering>
 </file>
@@ -9321,6 +11651,55 @@
       </w:tblBorders>
     </w:tblPr>
   </w:style>
+  <w:style w:type="paragraph" w:styleId="TOC1">
+    <w:name w:val="toc 1"/>
+    <w:basedOn w:val="Normal"/>
+    <w:next w:val="Normal"/>
+    <w:autoRedefine/>
+    <w:uiPriority w:val="39"/>
+    <w:unhideWhenUsed/>
+    <w:rsid w:val="00037B68"/>
+    <w:pPr>
+      <w:spacing w:after="100"/>
+    </w:pPr>
+  </w:style>
+  <w:style w:type="paragraph" w:styleId="TOC2">
+    <w:name w:val="toc 2"/>
+    <w:basedOn w:val="Normal"/>
+    <w:next w:val="Normal"/>
+    <w:autoRedefine/>
+    <w:uiPriority w:val="39"/>
+    <w:unhideWhenUsed/>
+    <w:rsid w:val="00037B68"/>
+    <w:pPr>
+      <w:spacing w:after="100"/>
+      <w:ind w:left="220"/>
+    </w:pPr>
+  </w:style>
+  <w:style w:type="paragraph" w:styleId="TOC3">
+    <w:name w:val="toc 3"/>
+    <w:basedOn w:val="Normal"/>
+    <w:next w:val="Normal"/>
+    <w:autoRedefine/>
+    <w:uiPriority w:val="39"/>
+    <w:unhideWhenUsed/>
+    <w:rsid w:val="00037B68"/>
+    <w:pPr>
+      <w:spacing w:after="100"/>
+      <w:ind w:left="440"/>
+    </w:pPr>
+  </w:style>
+  <w:style w:type="character" w:styleId="Hyperlink">
+    <w:name w:val="Hyperlink"/>
+    <w:basedOn w:val="DefaultParagraphFont"/>
+    <w:uiPriority w:val="99"/>
+    <w:unhideWhenUsed/>
+    <w:rsid w:val="00037B68"/>
+    <w:rPr>
+      <w:color w:val="0563C1" w:themeColor="hyperlink"/>
+      <w:u w:val="single"/>
+    </w:rPr>
+  </w:style>
 </w:styles>
 </file>
 

</xml_diff>

<commit_message>
fix: Add create-group.css for styling group creation page
</commit_message>
<xml_diff>
--- a/Report/Report.docx
+++ b/Report/Report.docx
@@ -3575,6 +3575,13 @@
     </w:p>
     <w:p>
       <w:pPr>
+        <w:rPr>
+          <w:lang w:val="en-KE"/>
+        </w:rPr>
+      </w:pPr>
+    </w:p>
+    <w:p>
+      <w:pPr>
         <w:pStyle w:val="Heading3"/>
         <w:rPr>
           <w:lang w:val="en-KE"/>
@@ -3585,6 +3592,7 @@
         <w:rPr>
           <w:lang w:val="en-KE"/>
         </w:rPr>
+        <w:lastRenderedPageBreak/>
         <w:t xml:space="preserve">2.2.2 </w:t>
       </w:r>
       <w:r>
@@ -3628,7 +3636,6 @@
           <w:bCs/>
           <w:lang w:val="en-KE"/>
         </w:rPr>
-        <w:lastRenderedPageBreak/>
         <w:t>Community Moderation:</w:t>
       </w:r>
       <w:r>
@@ -4026,20 +4033,6 @@
         </w:rPr>
         <w:t xml:space="preserve"> </w:t>
       </w:r>
-    </w:p>
-    <w:p>
-      <w:pPr>
-        <w:rPr>
-          <w:lang w:val="en-KE"/>
-        </w:rPr>
-      </w:pPr>
-    </w:p>
-    <w:p>
-      <w:pPr>
-        <w:rPr>
-          <w:lang w:val="en-KE"/>
-        </w:rPr>
-      </w:pPr>
     </w:p>
     <w:p>
       <w:pPr>

</xml_diff>

<commit_message>
Modification: Keeping updates of templates and static files
</commit_message>
<xml_diff>
--- a/Report/Report.docx
+++ b/Report/Report.docx
@@ -5587,13 +5587,6 @@
     <w:p>
       <w:pPr>
         <w:rPr>
-          <w:lang w:val="en-KE"/>
-        </w:rPr>
-      </w:pPr>
-    </w:p>
-    <w:p>
-      <w:pPr>
-        <w:rPr>
           <w:b/>
           <w:bCs/>
           <w:lang w:val="en-KE"/>
@@ -5605,6 +5598,7 @@
           <w:bCs/>
           <w:lang w:val="en-KE"/>
         </w:rPr>
+        <w:lastRenderedPageBreak/>
         <w:t>Flowchart of the Research Process</w:t>
       </w:r>
     </w:p>
@@ -5616,217 +5610,65 @@
       </w:pPr>
       <w:r>
         <w:rPr>
-          <w:lang w:val="en-KE"/>
-        </w:rPr>
-        <w:t>Start</w:t>
-      </w:r>
-    </w:p>
-    <w:p>
-      <w:pPr>
-        <w:rPr>
-          <w:lang w:val="en-KE"/>
-        </w:rPr>
-      </w:pPr>
-      <w:r>
-        <w:rPr>
-          <w:lang w:val="en-KE"/>
-        </w:rPr>
-        <w:t xml:space="preserve">   ↓</w:t>
-      </w:r>
-    </w:p>
-    <w:p>
-      <w:pPr>
-        <w:rPr>
-          <w:lang w:val="en-KE"/>
-        </w:rPr>
-      </w:pPr>
-      <w:r>
-        <w:rPr>
-          <w:lang w:val="en-KE"/>
-        </w:rPr>
-        <w:t>Problem Identification</w:t>
-      </w:r>
-    </w:p>
-    <w:p>
-      <w:pPr>
-        <w:rPr>
-          <w:lang w:val="en-KE"/>
-        </w:rPr>
-      </w:pPr>
-      <w:r>
-        <w:rPr>
-          <w:lang w:val="en-KE"/>
-        </w:rPr>
-        <w:t xml:space="preserve">   ↓</w:t>
-      </w:r>
-    </w:p>
-    <w:p>
-      <w:pPr>
-        <w:rPr>
-          <w:lang w:val="en-KE"/>
-        </w:rPr>
-      </w:pPr>
-      <w:r>
-        <w:rPr>
-          <w:lang w:val="en-KE"/>
-        </w:rPr>
-        <w:t>Requirement Gathering</w:t>
-      </w:r>
-    </w:p>
-    <w:p>
-      <w:pPr>
-        <w:rPr>
-          <w:lang w:val="en-KE"/>
-        </w:rPr>
-      </w:pPr>
-      <w:r>
-        <w:rPr>
-          <w:lang w:val="en-KE"/>
-        </w:rPr>
-        <w:t xml:space="preserve">   ↓</w:t>
-      </w:r>
-    </w:p>
-    <w:p>
-      <w:pPr>
-        <w:rPr>
-          <w:lang w:val="en-KE"/>
-        </w:rPr>
-      </w:pPr>
-      <w:r>
-        <w:rPr>
-          <w:lang w:val="en-KE"/>
-        </w:rPr>
-        <w:t>System Design</w:t>
-      </w:r>
-    </w:p>
-    <w:p>
-      <w:pPr>
-        <w:rPr>
-          <w:lang w:val="en-KE"/>
-        </w:rPr>
-      </w:pPr>
-      <w:r>
-        <w:rPr>
-          <w:lang w:val="en-KE"/>
-        </w:rPr>
-        <w:t xml:space="preserve">   ↓</w:t>
-      </w:r>
-    </w:p>
-    <w:p>
-      <w:pPr>
-        <w:rPr>
-          <w:lang w:val="en-KE"/>
-        </w:rPr>
-      </w:pPr>
-      <w:r>
-        <w:rPr>
-          <w:lang w:val="en-KE"/>
-        </w:rPr>
-        <w:t>Development</w:t>
-      </w:r>
-    </w:p>
-    <w:p>
-      <w:pPr>
-        <w:rPr>
-          <w:lang w:val="en-KE"/>
-        </w:rPr>
-      </w:pPr>
-      <w:r>
-        <w:rPr>
-          <w:lang w:val="en-KE"/>
-        </w:rPr>
-        <w:t xml:space="preserve">   ↓</w:t>
-      </w:r>
-    </w:p>
-    <w:p>
-      <w:pPr>
-        <w:rPr>
-          <w:lang w:val="en-KE"/>
-        </w:rPr>
-      </w:pPr>
-      <w:r>
-        <w:rPr>
-          <w:lang w:val="en-KE"/>
-        </w:rPr>
-        <w:t>Testing</w:t>
-      </w:r>
-    </w:p>
-    <w:p>
-      <w:pPr>
-        <w:rPr>
-          <w:lang w:val="en-KE"/>
-        </w:rPr>
-      </w:pPr>
-      <w:r>
-        <w:rPr>
-          <w:lang w:val="en-KE"/>
-        </w:rPr>
-        <w:t xml:space="preserve">   ↓</w:t>
-      </w:r>
-    </w:p>
-    <w:p>
-      <w:pPr>
-        <w:rPr>
-          <w:lang w:val="en-KE"/>
-        </w:rPr>
-      </w:pPr>
-      <w:r>
-        <w:rPr>
-          <w:lang w:val="en-KE"/>
-        </w:rPr>
-        <w:t>Deployment</w:t>
-      </w:r>
-    </w:p>
-    <w:p>
-      <w:pPr>
-        <w:rPr>
-          <w:lang w:val="en-KE"/>
-        </w:rPr>
-      </w:pPr>
-      <w:r>
-        <w:rPr>
-          <w:lang w:val="en-KE"/>
-        </w:rPr>
-        <w:t xml:space="preserve">   ↓</w:t>
-      </w:r>
-    </w:p>
-    <w:p>
-      <w:pPr>
-        <w:rPr>
-          <w:lang w:val="en-KE"/>
-        </w:rPr>
-      </w:pPr>
-      <w:r>
-        <w:rPr>
-          <w:lang w:val="en-KE"/>
-        </w:rPr>
-        <w:t>Evaluation &amp; Feedback</w:t>
-      </w:r>
-    </w:p>
-    <w:p>
-      <w:pPr>
-        <w:rPr>
-          <w:lang w:val="en-KE"/>
-        </w:rPr>
-      </w:pPr>
-      <w:r>
-        <w:rPr>
-          <w:lang w:val="en-KE"/>
-        </w:rPr>
-        <w:t xml:space="preserve">   ↓</w:t>
-      </w:r>
-    </w:p>
-    <w:p>
-      <w:pPr>
-        <w:rPr>
-          <w:lang w:val="en-KE"/>
-        </w:rPr>
-      </w:pPr>
-      <w:r>
-        <w:rPr>
-          <w:lang w:val="en-KE"/>
-        </w:rPr>
-        <w:t>End</w:t>
+          <w:noProof/>
+          <w:lang w:val="en-KE"/>
+        </w:rPr>
+        <w:drawing>
+          <wp:anchor distT="0" distB="0" distL="114300" distR="114300" simplePos="0" relativeHeight="251658240" behindDoc="0" locked="0" layoutInCell="1" allowOverlap="1" wp14:anchorId="33DD827E" wp14:editId="3802E92F">
+            <wp:simplePos x="0" y="0"/>
+            <wp:positionH relativeFrom="column">
+              <wp:posOffset>2126511</wp:posOffset>
+            </wp:positionH>
+            <wp:positionV relativeFrom="paragraph">
+              <wp:posOffset>213921</wp:posOffset>
+            </wp:positionV>
+            <wp:extent cx="1541780" cy="4157345"/>
+            <wp:effectExtent l="0" t="0" r="1270" b="0"/>
+            <wp:wrapTopAndBottom/>
+            <wp:docPr id="1948715335" name="Picture 1"/>
+            <wp:cNvGraphicFramePr>
+              <a:graphicFrameLocks xmlns:a="http://schemas.openxmlformats.org/drawingml/2006/main" noChangeAspect="1"/>
+            </wp:cNvGraphicFramePr>
+            <a:graphic xmlns:a="http://schemas.openxmlformats.org/drawingml/2006/main">
+              <a:graphicData uri="http://schemas.openxmlformats.org/drawingml/2006/picture">
+                <pic:pic xmlns:pic="http://schemas.openxmlformats.org/drawingml/2006/picture">
+                  <pic:nvPicPr>
+                    <pic:cNvPr id="0" name="Picture 1"/>
+                    <pic:cNvPicPr>
+                      <a:picLocks noChangeAspect="1" noChangeArrowheads="1"/>
+                    </pic:cNvPicPr>
+                  </pic:nvPicPr>
+                  <pic:blipFill>
+                    <a:blip r:embed="rId10">
+                      <a:extLst>
+                        <a:ext uri="{28A0092B-C50C-407E-A947-70E740481C1C}">
+                          <a14:useLocalDpi xmlns:a14="http://schemas.microsoft.com/office/drawing/2010/main" val="0"/>
+                        </a:ext>
+                      </a:extLst>
+                    </a:blip>
+                    <a:srcRect/>
+                    <a:stretch>
+                      <a:fillRect/>
+                    </a:stretch>
+                  </pic:blipFill>
+                  <pic:spPr bwMode="auto">
+                    <a:xfrm>
+                      <a:off x="0" y="0"/>
+                      <a:ext cx="1541780" cy="4157345"/>
+                    </a:xfrm>
+                    <a:prstGeom prst="rect">
+                      <a:avLst/>
+                    </a:prstGeom>
+                    <a:noFill/>
+                    <a:ln>
+                      <a:noFill/>
+                    </a:ln>
+                  </pic:spPr>
+                </pic:pic>
+              </a:graphicData>
+            </a:graphic>
+          </wp:anchor>
+        </w:drawing>
       </w:r>
     </w:p>
     <w:p>
@@ -6026,7 +5868,6 @@
         <w:rPr>
           <w:lang w:val="en-KE"/>
         </w:rPr>
-        <w:lastRenderedPageBreak/>
         <w:t xml:space="preserve">Agile consists of short development cycles called </w:t>
       </w:r>
       <w:r>
@@ -6056,6 +5897,7 @@
         <w:rPr>
           <w:lang w:val="en-KE"/>
         </w:rPr>
+        <w:lastRenderedPageBreak/>
         <w:t>3.3.2 Agile Process Steps</w:t>
       </w:r>
       <w:bookmarkEnd w:id="27"/>
@@ -6418,6 +6260,13 @@
     </w:p>
     <w:p>
       <w:pPr>
+        <w:rPr>
+          <w:lang w:val="en-KE"/>
+        </w:rPr>
+      </w:pPr>
+    </w:p>
+    <w:p>
+      <w:pPr>
         <w:pStyle w:val="Heading3"/>
         <w:rPr>
           <w:lang w:val="en-KE"/>
@@ -6466,427 +6315,88 @@
           <w:lang w:val="en-KE"/>
         </w:rPr>
       </w:pPr>
-      <w:r>
-        <w:rPr>
-          <w:lang w:val="en-KE"/>
-        </w:rPr>
-        <w:t xml:space="preserve">          +-------------------+</w:t>
-      </w:r>
-    </w:p>
-    <w:p>
-      <w:pPr>
-        <w:rPr>
-          <w:lang w:val="en-KE"/>
-        </w:rPr>
-      </w:pPr>
-      <w:r>
-        <w:rPr>
-          <w:lang w:val="en-KE"/>
-        </w:rPr>
-        <w:t xml:space="preserve">          |    Planning       |</w:t>
-      </w:r>
-    </w:p>
-    <w:p>
-      <w:pPr>
-        <w:rPr>
-          <w:lang w:val="en-KE"/>
-        </w:rPr>
-      </w:pPr>
-      <w:r>
-        <w:rPr>
-          <w:lang w:val="en-KE"/>
-        </w:rPr>
-        <w:t xml:space="preserve">          +-------------------+</w:t>
-      </w:r>
-    </w:p>
-    <w:p>
-      <w:pPr>
-        <w:rPr>
-          <w:lang w:val="en-KE"/>
-        </w:rPr>
-      </w:pPr>
-      <w:r>
-        <w:rPr>
-          <w:lang w:val="en-KE"/>
-        </w:rPr>
-        <w:t xml:space="preserve">                   ↓</w:t>
-      </w:r>
-    </w:p>
-    <w:p>
-      <w:pPr>
-        <w:rPr>
-          <w:lang w:val="en-KE"/>
-        </w:rPr>
-      </w:pPr>
-      <w:r>
-        <w:rPr>
-          <w:lang w:val="en-KE"/>
-        </w:rPr>
-        <w:t xml:space="preserve">          +-------------------+</w:t>
-      </w:r>
-    </w:p>
-    <w:p>
-      <w:pPr>
-        <w:rPr>
-          <w:lang w:val="en-KE"/>
-        </w:rPr>
-      </w:pPr>
-      <w:r>
-        <w:rPr>
-          <w:lang w:val="en-KE"/>
-        </w:rPr>
-        <w:t xml:space="preserve">          |    Design         |</w:t>
-      </w:r>
-    </w:p>
-    <w:p>
-      <w:pPr>
-        <w:rPr>
-          <w:lang w:val="en-KE"/>
-        </w:rPr>
-      </w:pPr>
-      <w:r>
-        <w:rPr>
-          <w:lang w:val="en-KE"/>
-        </w:rPr>
-        <w:t xml:space="preserve">          +-------------------+</w:t>
-      </w:r>
-    </w:p>
-    <w:p>
-      <w:pPr>
-        <w:rPr>
-          <w:lang w:val="en-KE"/>
-        </w:rPr>
-      </w:pPr>
-      <w:r>
-        <w:rPr>
-          <w:lang w:val="en-KE"/>
-        </w:rPr>
-        <w:t xml:space="preserve">                   ↓</w:t>
-      </w:r>
-    </w:p>
-    <w:p>
-      <w:pPr>
-        <w:rPr>
-          <w:lang w:val="en-KE"/>
-        </w:rPr>
-      </w:pPr>
-      <w:r>
-        <w:rPr>
-          <w:lang w:val="en-KE"/>
-        </w:rPr>
-        <w:t xml:space="preserve">          +-------------------+</w:t>
-      </w:r>
-    </w:p>
-    <w:p>
-      <w:pPr>
-        <w:rPr>
-          <w:lang w:val="en-KE"/>
-        </w:rPr>
-      </w:pPr>
-      <w:r>
-        <w:rPr>
-          <w:lang w:val="en-KE"/>
-        </w:rPr>
-        <w:t xml:space="preserve">          |   Development     |</w:t>
-      </w:r>
-    </w:p>
-    <w:p>
-      <w:pPr>
-        <w:rPr>
-          <w:lang w:val="en-KE"/>
-        </w:rPr>
-      </w:pPr>
-      <w:r>
-        <w:rPr>
-          <w:lang w:val="en-KE"/>
-        </w:rPr>
-        <w:t xml:space="preserve">          +-------------------+</w:t>
-      </w:r>
-    </w:p>
-    <w:p>
-      <w:pPr>
-        <w:rPr>
-          <w:lang w:val="en-KE"/>
-        </w:rPr>
-      </w:pPr>
-      <w:r>
-        <w:rPr>
-          <w:lang w:val="en-KE"/>
-        </w:rPr>
-        <w:t xml:space="preserve">                   ↓</w:t>
-      </w:r>
-    </w:p>
-    <w:p>
-      <w:pPr>
-        <w:rPr>
-          <w:lang w:val="en-KE"/>
-        </w:rPr>
-      </w:pPr>
-      <w:r>
-        <w:rPr>
-          <w:lang w:val="en-KE"/>
-        </w:rPr>
-        <w:t xml:space="preserve">          +-------------------+</w:t>
-      </w:r>
-    </w:p>
-    <w:p>
-      <w:pPr>
-        <w:rPr>
-          <w:lang w:val="en-KE"/>
-        </w:rPr>
-      </w:pPr>
-      <w:r>
-        <w:rPr>
-          <w:lang w:val="en-KE"/>
-        </w:rPr>
-        <w:t xml:space="preserve">          |    Testing        |</w:t>
-      </w:r>
-    </w:p>
-    <w:p>
-      <w:pPr>
-        <w:rPr>
-          <w:lang w:val="en-KE"/>
-        </w:rPr>
-      </w:pPr>
-      <w:r>
-        <w:rPr>
-          <w:lang w:val="en-KE"/>
-        </w:rPr>
-        <w:t xml:space="preserve">          +-------------------+</w:t>
-      </w:r>
-    </w:p>
-    <w:p>
-      <w:pPr>
-        <w:rPr>
-          <w:lang w:val="en-KE"/>
-        </w:rPr>
-      </w:pPr>
-      <w:r>
-        <w:rPr>
-          <w:lang w:val="en-KE"/>
-        </w:rPr>
-        <w:t xml:space="preserve">                   ↓</w:t>
-      </w:r>
-    </w:p>
-    <w:p>
-      <w:pPr>
-        <w:rPr>
-          <w:lang w:val="en-KE"/>
-        </w:rPr>
-      </w:pPr>
-      <w:r>
-        <w:rPr>
-          <w:lang w:val="en-KE"/>
-        </w:rPr>
-        <w:t xml:space="preserve">          +-------------------+</w:t>
-      </w:r>
-    </w:p>
-    <w:p>
-      <w:pPr>
-        <w:rPr>
-          <w:lang w:val="en-KE"/>
-        </w:rPr>
-      </w:pPr>
-      <w:r>
-        <w:rPr>
-          <w:lang w:val="en-KE"/>
-        </w:rPr>
-        <w:t xml:space="preserve">          |    Review         |</w:t>
-      </w:r>
-    </w:p>
-    <w:p>
-      <w:pPr>
-        <w:rPr>
-          <w:lang w:val="en-KE"/>
-        </w:rPr>
-      </w:pPr>
-      <w:r>
-        <w:rPr>
-          <w:lang w:val="en-KE"/>
-        </w:rPr>
-        <w:t xml:space="preserve">          +-------------------+</w:t>
-      </w:r>
-    </w:p>
-    <w:p>
-      <w:pPr>
-        <w:rPr>
-          <w:lang w:val="en-KE"/>
-        </w:rPr>
-      </w:pPr>
-      <w:r>
-        <w:rPr>
-          <w:lang w:val="en-KE"/>
-        </w:rPr>
-        <w:t xml:space="preserve">                   ↓</w:t>
-      </w:r>
-    </w:p>
-    <w:p>
-      <w:pPr>
-        <w:rPr>
-          <w:lang w:val="en-KE"/>
-        </w:rPr>
-      </w:pPr>
-      <w:r>
-        <w:rPr>
-          <w:lang w:val="en-KE"/>
-        </w:rPr>
-        <w:t xml:space="preserve">          +-------------------+</w:t>
-      </w:r>
-    </w:p>
-    <w:p>
-      <w:pPr>
-        <w:rPr>
-          <w:lang w:val="en-KE"/>
-        </w:rPr>
-      </w:pPr>
-      <w:r>
-        <w:rPr>
-          <w:lang w:val="en-KE"/>
-        </w:rPr>
-        <w:t xml:space="preserve">          </w:t>
-      </w:r>
-      <w:proofErr w:type="gramStart"/>
-      <w:r>
-        <w:rPr>
-          <w:lang w:val="en-KE"/>
-        </w:rPr>
-        <w:t>|  Deployment</w:t>
-      </w:r>
-      <w:proofErr w:type="gramEnd"/>
-      <w:r>
-        <w:rPr>
-          <w:lang w:val="en-KE"/>
-        </w:rPr>
-        <w:t xml:space="preserve">       |</w:t>
-      </w:r>
-    </w:p>
-    <w:p>
-      <w:pPr>
-        <w:rPr>
-          <w:lang w:val="en-KE"/>
-        </w:rPr>
-      </w:pPr>
-      <w:r>
-        <w:rPr>
-          <w:lang w:val="en-KE"/>
-        </w:rPr>
-        <w:t xml:space="preserve">          +-------------------+</w:t>
-      </w:r>
-    </w:p>
-    <w:p>
-      <w:pPr>
-        <w:rPr>
-          <w:lang w:val="en-KE"/>
-        </w:rPr>
-      </w:pPr>
-      <w:r>
-        <w:rPr>
-          <w:lang w:val="en-KE"/>
-        </w:rPr>
-        <w:t xml:space="preserve">                   ↓</w:t>
-      </w:r>
-    </w:p>
-    <w:p>
-      <w:pPr>
-        <w:rPr>
-          <w:lang w:val="en-KE"/>
-        </w:rPr>
-      </w:pPr>
-      <w:r>
-        <w:rPr>
-          <w:lang w:val="en-KE"/>
-        </w:rPr>
-        <w:t xml:space="preserve">          +-------------------+</w:t>
-      </w:r>
-    </w:p>
-    <w:p>
-      <w:pPr>
-        <w:rPr>
-          <w:lang w:val="en-KE"/>
-        </w:rPr>
-      </w:pPr>
-      <w:r>
-        <w:rPr>
-          <w:lang w:val="en-KE"/>
-        </w:rPr>
-        <w:t xml:space="preserve">          </w:t>
-      </w:r>
-      <w:proofErr w:type="gramStart"/>
-      <w:r>
-        <w:rPr>
-          <w:lang w:val="en-KE"/>
-        </w:rPr>
-        <w:t>|  Maintenance</w:t>
-      </w:r>
-      <w:proofErr w:type="gramEnd"/>
-      <w:r>
-        <w:rPr>
-          <w:lang w:val="en-KE"/>
-        </w:rPr>
-        <w:t xml:space="preserve">      |</w:t>
-      </w:r>
-    </w:p>
-    <w:p>
-      <w:pPr>
-        <w:rPr>
-          <w:lang w:val="en-KE"/>
-        </w:rPr>
-      </w:pPr>
-      <w:r>
-        <w:rPr>
-          <w:lang w:val="en-KE"/>
-        </w:rPr>
-        <w:t xml:space="preserve">          +-------------------+</w:t>
-      </w:r>
-    </w:p>
-    <w:p>
-      <w:pPr>
-        <w:rPr>
-          <w:lang w:val="en-KE"/>
-        </w:rPr>
-      </w:pPr>
-      <w:r>
-        <w:rPr>
-          <w:lang w:val="en-KE"/>
-        </w:rPr>
-        <w:t xml:space="preserve">                   ↑</w:t>
-      </w:r>
-    </w:p>
-    <w:p>
-      <w:pPr>
-        <w:rPr>
-          <w:lang w:val="en-KE"/>
-        </w:rPr>
-      </w:pPr>
-      <w:r>
-        <w:rPr>
-          <w:lang w:val="en-KE"/>
-        </w:rPr>
-        <w:lastRenderedPageBreak/>
-        <w:t xml:space="preserve">                   |</w:t>
-      </w:r>
-    </w:p>
-    <w:p>
-      <w:pPr>
-        <w:rPr>
-          <w:lang w:val="en-KE"/>
-        </w:rPr>
-      </w:pPr>
-      <w:r>
-        <w:rPr>
-          <w:lang w:val="en-KE"/>
-        </w:rPr>
-        <w:t xml:space="preserve">        (Feedback Loop / Next Sprint)</w:t>
-      </w:r>
-    </w:p>
-    <w:p>
-      <w:pPr>
-        <w:pStyle w:val="Heading3"/>
-        <w:rPr>
-          <w:lang w:val="en-KE"/>
-        </w:rPr>
-      </w:pPr>
+    </w:p>
+    <w:p>
+      <w:pPr>
+        <w:rPr>
+          <w:lang w:val="en-KE"/>
+        </w:rPr>
+      </w:pPr>
+      <w:r>
+        <w:rPr>
+          <w:lang w:val="en-KE"/>
+        </w:rPr>
+        <w:t xml:space="preserve">      </w:t>
+      </w:r>
       <w:bookmarkStart w:id="29" w:name="_Toc223792172"/>
+      <w:r>
+        <w:rPr>
+          <w:noProof/>
+          <w:lang w:val="en-KE"/>
+        </w:rPr>
+        <w:drawing>
+          <wp:inline distT="0" distB="0" distL="0" distR="0" wp14:anchorId="00AC9736" wp14:editId="5BA1EA9B">
+            <wp:extent cx="5943600" cy="1438275"/>
+            <wp:effectExtent l="0" t="0" r="0" b="9525"/>
+            <wp:docPr id="195173516" name="Picture 2"/>
+            <wp:cNvGraphicFramePr>
+              <a:graphicFrameLocks xmlns:a="http://schemas.openxmlformats.org/drawingml/2006/main" noChangeAspect="1"/>
+            </wp:cNvGraphicFramePr>
+            <a:graphic xmlns:a="http://schemas.openxmlformats.org/drawingml/2006/main">
+              <a:graphicData uri="http://schemas.openxmlformats.org/drawingml/2006/picture">
+                <pic:pic xmlns:pic="http://schemas.openxmlformats.org/drawingml/2006/picture">
+                  <pic:nvPicPr>
+                    <pic:cNvPr id="0" name="Picture 2"/>
+                    <pic:cNvPicPr>
+                      <a:picLocks noChangeAspect="1" noChangeArrowheads="1"/>
+                    </pic:cNvPicPr>
+                  </pic:nvPicPr>
+                  <pic:blipFill>
+                    <a:blip r:embed="rId11">
+                      <a:extLst>
+                        <a:ext uri="{28A0092B-C50C-407E-A947-70E740481C1C}">
+                          <a14:useLocalDpi xmlns:a14="http://schemas.microsoft.com/office/drawing/2010/main" val="0"/>
+                        </a:ext>
+                      </a:extLst>
+                    </a:blip>
+                    <a:srcRect/>
+                    <a:stretch>
+                      <a:fillRect/>
+                    </a:stretch>
+                  </pic:blipFill>
+                  <pic:spPr bwMode="auto">
+                    <a:xfrm>
+                      <a:off x="0" y="0"/>
+                      <a:ext cx="5943600" cy="1438275"/>
+                    </a:xfrm>
+                    <a:prstGeom prst="rect">
+                      <a:avLst/>
+                    </a:prstGeom>
+                    <a:noFill/>
+                    <a:ln>
+                      <a:noFill/>
+                    </a:ln>
+                  </pic:spPr>
+                </pic:pic>
+              </a:graphicData>
+            </a:graphic>
+          </wp:inline>
+        </w:drawing>
+      </w:r>
+    </w:p>
+    <w:p>
+      <w:pPr>
+        <w:rPr>
+          <w:lang w:val="en-KE"/>
+        </w:rPr>
+      </w:pPr>
+    </w:p>
+    <w:p>
+      <w:pPr>
+        <w:rPr>
+          <w:lang w:val="en-KE"/>
+        </w:rPr>
+      </w:pPr>
       <w:r>
         <w:rPr>
           <w:lang w:val="en-KE"/>
@@ -7184,14 +6694,6 @@
         <w:t xml:space="preserve"> solution that is adaptable, efficient, and capable of delivering a reliable platform for academic quizzes and knowledge sharing.</w:t>
       </w:r>
     </w:p>
-    <w:p/>
-    <w:p/>
-    <w:p/>
-    <w:p/>
-    <w:p/>
-    <w:p/>
-    <w:p/>
-    <w:p/>
     <w:p>
       <w:pPr>
         <w:pStyle w:val="Heading1"/>
@@ -7209,8 +6711,8 @@
     <w:p/>
     <w:p/>
     <w:sectPr>
-      <w:headerReference w:type="default" r:id="rId10"/>
-      <w:footerReference w:type="default" r:id="rId11"/>
+      <w:headerReference w:type="default" r:id="rId12"/>
+      <w:footerReference w:type="default" r:id="rId13"/>
       <w:pgSz w:w="12240" w:h="15840"/>
       <w:pgMar w:top="1440" w:right="1440" w:bottom="1440" w:left="1440" w:header="708" w:footer="708" w:gutter="0"/>
       <w:pgNumType w:start="1"/>

</xml_diff>